<commit_message>
Fix text alignment, list indents, table padding, and image scaling in Word report
</commit_message>
<xml_diff>
--- a/Mini_Project_Report_AIAD.docx
+++ b/Mini_Project_Report_AIAD.docx
@@ -4,7 +4,7 @@
   <w:body>
     <w:p>
       <w:pPr>
-        <w:spacing w:before="0" w:after="400" w:line="288" w:lineRule="auto"/>
+        <w:spacing w:before="0" w:after="280" w:line="276" w:lineRule="auto"/>
         <w:jc w:val="center"/>
       </w:pPr>
       <w:r>
@@ -35,7 +35,7 @@
           <w:b w:val="0"/>
           <w:i w:val="0"/>
           <w:color w:val="000000"/>
-          <w:sz w:val="22"/>
+          <w:sz w:val="21"/>
         </w:rPr>
         <w:t>(An Autonomous Institute)</w:t>
         <w:br/>
@@ -46,7 +46,7 @@
           <w:b w:val="0"/>
           <w:i w:val="0"/>
           <w:color w:val="000000"/>
-          <w:sz w:val="20"/>
+          <w:sz w:val="19"/>
         </w:rPr>
         <w:t>Affiliated to Dr. Babasaheb Ambedkar Marathwada University (Dr. BAMU), Chhatrapati Sambhajinagar</w:t>
         <w:br/>
@@ -57,7 +57,7 @@
           <w:b w:val="0"/>
           <w:i w:val="0"/>
           <w:color w:val="000000"/>
-          <w:sz w:val="20"/>
+          <w:sz w:val="19"/>
         </w:rPr>
         <w:t>AICTE Approved, (Accredited with "Grade A" by NAAC)</w:t>
         <w:br/>
@@ -76,7 +76,7 @@
     </w:p>
     <w:p>
       <w:pPr>
-        <w:spacing w:before="300" w:after="300" w:line="360" w:lineRule="auto"/>
+        <w:spacing w:before="200" w:after="200" w:line="240" w:lineRule="auto"/>
         <w:jc w:val="center"/>
       </w:pPr>
       <w:r>
@@ -92,7 +92,7 @@
     </w:p>
     <w:p>
       <w:pPr>
-        <w:spacing w:before="200" w:after="700" w:line="288" w:lineRule="auto"/>
+        <w:spacing w:before="120" w:after="440" w:line="288" w:lineRule="auto"/>
         <w:jc w:val="center"/>
       </w:pPr>
       <w:r>
@@ -108,7 +108,7 @@
     </w:p>
     <w:p>
       <w:pPr>
-        <w:spacing w:before="0" w:after="500" w:line="312" w:lineRule="auto"/>
+        <w:spacing w:before="0" w:after="360" w:line="288" w:lineRule="auto"/>
         <w:jc w:val="center"/>
       </w:pPr>
       <w:r>
@@ -162,12 +162,11 @@
           <w:sz w:val="22"/>
         </w:rPr>
         <w:t>(Roll No: ____________)</w:t>
-        <w:br/>
       </w:r>
     </w:p>
     <w:p>
       <w:pPr>
-        <w:spacing w:before="0" w:after="500" w:line="312" w:lineRule="auto"/>
+        <w:spacing w:before="0" w:after="360" w:line="288" w:lineRule="auto"/>
         <w:jc w:val="center"/>
       </w:pPr>
       <w:r>
@@ -190,12 +189,11 @@
           <w:sz w:val="24"/>
         </w:rPr>
         <w:t>Mrs. Sarika Zile / Ms. Priya Khandelwal / Ms. Pooja Alone</w:t>
-        <w:br/>
       </w:r>
     </w:p>
     <w:p>
       <w:pPr>
-        <w:spacing w:before="0" w:after="700" w:line="288" w:lineRule="auto"/>
+        <w:spacing w:before="0" w:after="440" w:line="276" w:lineRule="auto"/>
         <w:jc w:val="center"/>
       </w:pPr>
       <w:r>
@@ -204,14 +202,14 @@
           <w:b/>
           <w:i w:val="0"/>
           <w:color w:val="000000"/>
-          <w:sz w:val="24"/>
+          <w:sz w:val="23"/>
         </w:rPr>
         <w:t>In partial fulfillment of the award of Bachelor of Technology in Computer Science and Engineering</w:t>
       </w:r>
     </w:p>
     <w:p>
       <w:pPr>
-        <w:spacing w:before="400" w:after="120" w:line="312" w:lineRule="auto"/>
+        <w:spacing w:before="200" w:after="0" w:line="288" w:lineRule="auto"/>
         <w:jc w:val="center"/>
       </w:pPr>
       <w:r>
@@ -220,7 +218,7 @@
           <w:b w:val="0"/>
           <w:i w:val="0"/>
           <w:color w:val="000000"/>
-          <w:sz w:val="28"/>
+          <w:sz w:val="26"/>
         </w:rPr>
         <w:t>Department of Computer Science and Engineering</w:t>
         <w:br/>
@@ -256,7 +254,8 @@
     </w:p>
     <w:p>
       <w:pPr>
-        <w:spacing w:before="360" w:after="160" w:line="276" w:lineRule="auto"/>
+        <w:keepNext/>
+        <w:spacing w:before="320" w:after="120" w:line="276" w:lineRule="auto"/>
         <w:jc w:val="left"/>
       </w:pPr>
       <w:r>
@@ -272,7 +271,7 @@
     </w:p>
     <w:p>
       <w:pPr>
-        <w:spacing w:before="0" w:after="400" w:line="360" w:lineRule="auto"/>
+        <w:spacing w:before="0" w:after="320" w:line="288" w:lineRule="auto"/>
         <w:jc w:val="center"/>
       </w:pPr>
       <w:r>
@@ -307,7 +306,7 @@
     </w:p>
     <w:p>
       <w:pPr>
-        <w:spacing w:before="0" w:after="1000" w:line="360" w:lineRule="auto"/>
+        <w:spacing w:before="0" w:after="700" w:line="360" w:lineRule="auto"/>
         <w:ind w:firstLine="576"/>
         <w:jc w:val="both"/>
       </w:pPr>
@@ -326,12 +325,11 @@
       <w:tblPr>
         <w:tblW w:type="auto" w:w="0"/>
         <w:jc w:val="center"/>
-        <w:tblLayout w:type="autofit"/>
         <w:tblLook w:firstColumn="1" w:firstRow="1" w:lastColumn="0" w:lastRow="0" w:noHBand="0" w:noVBand="1" w:val="04A0"/>
       </w:tblPr>
       <w:tblGrid>
-        <w:gridCol w:w="4334"/>
-        <w:gridCol w:w="4334"/>
+        <w:gridCol w:w="4320"/>
+        <w:gridCol w:w="4320"/>
       </w:tblGrid>
       <w:tr>
         <w:tc>
@@ -382,7 +380,8 @@
     </w:tbl>
     <w:p>
       <w:pPr>
-        <w:spacing w:before="360" w:after="160" w:line="276" w:lineRule="auto"/>
+        <w:keepNext/>
+        <w:spacing w:before="320" w:after="120" w:line="276" w:lineRule="auto"/>
         <w:jc w:val="left"/>
       </w:pPr>
       <w:r>
@@ -437,7 +436,8 @@
     </w:p>
     <w:p>
       <w:pPr>
-        <w:spacing w:before="360" w:after="160" w:line="276" w:lineRule="auto"/>
+        <w:keepNext/>
+        <w:spacing w:before="320" w:after="120" w:line="276" w:lineRule="auto"/>
         <w:jc w:val="left"/>
       </w:pPr>
       <w:r>
@@ -487,7 +487,8 @@
     </w:p>
     <w:p>
       <w:pPr>
-        <w:spacing w:before="360" w:after="160" w:line="276" w:lineRule="auto"/>
+        <w:keepNext/>
+        <w:spacing w:before="320" w:after="120" w:line="276" w:lineRule="auto"/>
         <w:jc w:val="left"/>
       </w:pPr>
       <w:r>
@@ -508,8 +509,8 @@
         <w:tblLook w:firstColumn="1" w:firstRow="1" w:lastColumn="0" w:lastRow="0" w:noHBand="0" w:noVBand="1" w:val="04A0"/>
       </w:tblPr>
       <w:tblGrid>
-        <w:gridCol w:w="4334"/>
-        <w:gridCol w:w="4334"/>
+        <w:gridCol w:w="7488"/>
+        <w:gridCol w:w="1152"/>
       </w:tblGrid>
       <w:tr>
         <w:tc>
@@ -820,7 +821,8 @@
     </w:p>
     <w:p>
       <w:pPr>
-        <w:spacing w:before="360" w:after="160" w:line="276" w:lineRule="auto"/>
+        <w:keepNext/>
+        <w:spacing w:before="320" w:after="120" w:line="276" w:lineRule="auto"/>
         <w:jc w:val="left"/>
       </w:pPr>
       <w:r>
@@ -836,7 +838,8 @@
     </w:p>
     <w:p>
       <w:pPr>
-        <w:spacing w:before="240" w:after="120" w:line="276" w:lineRule="auto"/>
+        <w:keepNext/>
+        <w:spacing w:before="200" w:after="80" w:line="276" w:lineRule="auto"/>
         <w:jc w:val="left"/>
       </w:pPr>
       <w:r>
@@ -886,7 +889,8 @@
     </w:p>
     <w:p>
       <w:pPr>
-        <w:spacing w:before="240" w:after="120" w:line="276" w:lineRule="auto"/>
+        <w:keepNext/>
+        <w:spacing w:before="200" w:after="80" w:line="276" w:lineRule="auto"/>
         <w:jc w:val="left"/>
       </w:pPr>
       <w:r>
@@ -931,15 +935,26 @@
           <w:color w:val="000000"/>
           <w:sz w:val="24"/>
         </w:rPr>
-        <w:t>The goal of this Mini-Project is to design, develop, test, and deploy a Domain-Specific Conversational AI Agent that:</w:t>
+        <w:t>The goal of this Mini-Project is to design, develop, test, and deploy a Domain-Specific Conversational AI Agent that fulfills five core operational requirements:</w:t>
       </w:r>
     </w:p>
     <w:p>
       <w:pPr>
-        <w:spacing w:before="0" w:after="120" w:line="360" w:lineRule="auto"/>
-        <w:ind w:firstLine="576"/>
+        <w:spacing w:before="20" w:after="80" w:line="324" w:lineRule="auto"/>
+        <w:ind w:left="432" w:hanging="432"/>
         <w:jc w:val="both"/>
       </w:pPr>
+      <w:r>
+        <w:rPr>
+          <w:rFonts w:ascii="Times New Roman" w:hAnsi="Times New Roman"/>
+          <w:b/>
+          <w:i w:val="0"/>
+          <w:color w:val="000000"/>
+          <w:sz w:val="24"/>
+        </w:rPr>
+        <w:t>1.</w:t>
+        <w:tab/>
+      </w:r>
       <w:r>
         <w:rPr>
           <w:rFonts w:ascii="Times New Roman" w:hAnsi="Times New Roman"/>
@@ -948,15 +963,26 @@
           <w:color w:val="000000"/>
           <w:sz w:val="24"/>
         </w:rPr>
-        <w:t>1. Acts as an authentic in-game NPC ("Eldrin the Archivist") within the fantasy world of Chronicles of Prasa.</w:t>
+        <w:t>Acts as an authentic in-game NPC ("Eldrin the Archivist") within the fantasy world of Chronicles of Prasa.</w:t>
       </w:r>
     </w:p>
     <w:p>
       <w:pPr>
-        <w:spacing w:before="0" w:after="120" w:line="360" w:lineRule="auto"/>
-        <w:ind w:firstLine="576"/>
+        <w:spacing w:before="20" w:after="80" w:line="324" w:lineRule="auto"/>
+        <w:ind w:left="432" w:hanging="432"/>
         <w:jc w:val="both"/>
       </w:pPr>
+      <w:r>
+        <w:rPr>
+          <w:rFonts w:ascii="Times New Roman" w:hAnsi="Times New Roman"/>
+          <w:b/>
+          <w:i w:val="0"/>
+          <w:color w:val="000000"/>
+          <w:sz w:val="24"/>
+        </w:rPr>
+        <w:t>2.</w:t>
+        <w:tab/>
+      </w:r>
       <w:r>
         <w:rPr>
           <w:rFonts w:ascii="Times New Roman" w:hAnsi="Times New Roman"/>
@@ -965,15 +991,26 @@
           <w:color w:val="000000"/>
           <w:sz w:val="24"/>
         </w:rPr>
-        <w:t>2. Enforces strict domain guardrails, politely refusing out-of-domain real-world questions while maintaining persona.</w:t>
+        <w:t>Enforces strict domain guardrails, politely refusing out-of-domain real-world questions while maintaining persona.</w:t>
       </w:r>
     </w:p>
     <w:p>
       <w:pPr>
-        <w:spacing w:before="0" w:after="120" w:line="360" w:lineRule="auto"/>
-        <w:ind w:firstLine="576"/>
+        <w:spacing w:before="20" w:after="80" w:line="324" w:lineRule="auto"/>
+        <w:ind w:left="432" w:hanging="432"/>
         <w:jc w:val="both"/>
       </w:pPr>
+      <w:r>
+        <w:rPr>
+          <w:rFonts w:ascii="Times New Roman" w:hAnsi="Times New Roman"/>
+          <w:b/>
+          <w:i w:val="0"/>
+          <w:color w:val="000000"/>
+          <w:sz w:val="24"/>
+        </w:rPr>
+        <w:t>3.</w:t>
+        <w:tab/>
+      </w:r>
       <w:r>
         <w:rPr>
           <w:rFonts w:ascii="Times New Roman" w:hAnsi="Times New Roman"/>
@@ -982,15 +1019,26 @@
           <w:color w:val="000000"/>
           <w:sz w:val="24"/>
         </w:rPr>
-        <w:t>3. Dynamically retrieves factual lore from an external knowledge base (game_lore.txt) using tool-calling capabilities.</w:t>
+        <w:t>Dynamically retrieves factual lore from an external knowledge base (game_lore.txt) using tool-calling capabilities.</w:t>
       </w:r>
     </w:p>
     <w:p>
       <w:pPr>
-        <w:spacing w:before="0" w:after="120" w:line="360" w:lineRule="auto"/>
-        <w:ind w:firstLine="576"/>
+        <w:spacing w:before="20" w:after="80" w:line="324" w:lineRule="auto"/>
+        <w:ind w:left="432" w:hanging="432"/>
         <w:jc w:val="both"/>
       </w:pPr>
+      <w:r>
+        <w:rPr>
+          <w:rFonts w:ascii="Times New Roman" w:hAnsi="Times New Roman"/>
+          <w:b/>
+          <w:i w:val="0"/>
+          <w:color w:val="000000"/>
+          <w:sz w:val="24"/>
+        </w:rPr>
+        <w:t>4.</w:t>
+        <w:tab/>
+      </w:r>
       <w:r>
         <w:rPr>
           <w:rFonts w:ascii="Times New Roman" w:hAnsi="Times New Roman"/>
@@ -999,15 +1047,26 @@
           <w:color w:val="000000"/>
           <w:sz w:val="24"/>
         </w:rPr>
-        <w:t>4. Maintains multi-turn conversational memory so user follow-ups are coherent.</w:t>
+        <w:t>Maintains multi-turn conversational memory so user follow-ups are coherent across dialogue turns.</w:t>
       </w:r>
     </w:p>
     <w:p>
       <w:pPr>
-        <w:spacing w:before="0" w:after="120" w:line="360" w:lineRule="auto"/>
-        <w:ind w:firstLine="576"/>
+        <w:spacing w:before="20" w:after="80" w:line="324" w:lineRule="auto"/>
+        <w:ind w:left="432" w:hanging="432"/>
         <w:jc w:val="both"/>
       </w:pPr>
+      <w:r>
+        <w:rPr>
+          <w:rFonts w:ascii="Times New Roman" w:hAnsi="Times New Roman"/>
+          <w:b/>
+          <w:i w:val="0"/>
+          <w:color w:val="000000"/>
+          <w:sz w:val="24"/>
+        </w:rPr>
+        <w:t>5.</w:t>
+        <w:tab/>
+      </w:r>
       <w:r>
         <w:rPr>
           <w:rFonts w:ascii="Times New Roman" w:hAnsi="Times New Roman"/>
@@ -1016,12 +1075,13 @@
           <w:color w:val="000000"/>
           <w:sz w:val="24"/>
         </w:rPr>
-        <w:t>5. Provides an immersive, retro-gamified Web UI with audio synthesis, voice output, and dual deployment (Localhost &amp; GitHub Pages).</w:t>
+        <w:t>Provides an immersive, retro-gamified Web UI with audio synthesis, voice output, and dual deployment (Localhost &amp; GitHub Pages).</w:t>
       </w:r>
     </w:p>
     <w:p>
       <w:pPr>
-        <w:spacing w:before="240" w:after="120" w:line="276" w:lineRule="auto"/>
+        <w:keepNext/>
+        <w:spacing w:before="200" w:after="80" w:line="276" w:lineRule="auto"/>
         <w:jc w:val="left"/>
       </w:pPr>
       <w:r>
@@ -1037,10 +1097,21 @@
     </w:p>
     <w:p>
       <w:pPr>
-        <w:spacing w:before="0" w:after="120" w:line="360" w:lineRule="auto"/>
-        <w:ind w:firstLine="576"/>
+        <w:spacing w:before="20" w:after="80" w:line="324" w:lineRule="auto"/>
+        <w:ind w:left="432" w:hanging="432"/>
         <w:jc w:val="both"/>
       </w:pPr>
+      <w:r>
+        <w:rPr>
+          <w:rFonts w:ascii="Times New Roman" w:hAnsi="Times New Roman"/>
+          <w:b/>
+          <w:i w:val="0"/>
+          <w:color w:val="000000"/>
+          <w:sz w:val="24"/>
+        </w:rPr>
+        <w:t>•</w:t>
+        <w:tab/>
+      </w:r>
       <w:r>
         <w:rPr>
           <w:rFonts w:ascii="Times New Roman" w:hAnsi="Times New Roman"/>
@@ -1049,15 +1120,26 @@
           <w:color w:val="000000"/>
           <w:sz w:val="24"/>
         </w:rPr>
-        <w:t>• Persona &amp; Prompt Engineering: Implement a system prompt that locks the model into an ancient fantasy archivist tone.</w:t>
+        <w:t>Persona &amp; Prompt Engineering: Implement a system prompt that locks the model into an ancient fantasy archivist tone.</w:t>
       </w:r>
     </w:p>
     <w:p>
       <w:pPr>
-        <w:spacing w:before="0" w:after="120" w:line="360" w:lineRule="auto"/>
-        <w:ind w:firstLine="576"/>
+        <w:spacing w:before="20" w:after="80" w:line="324" w:lineRule="auto"/>
+        <w:ind w:left="432" w:hanging="432"/>
         <w:jc w:val="both"/>
       </w:pPr>
+      <w:r>
+        <w:rPr>
+          <w:rFonts w:ascii="Times New Roman" w:hAnsi="Times New Roman"/>
+          <w:b/>
+          <w:i w:val="0"/>
+          <w:color w:val="000000"/>
+          <w:sz w:val="24"/>
+        </w:rPr>
+        <w:t>•</w:t>
+        <w:tab/>
+      </w:r>
       <w:r>
         <w:rPr>
           <w:rFonts w:ascii="Times New Roman" w:hAnsi="Times New Roman"/>
@@ -1066,15 +1148,26 @@
           <w:color w:val="000000"/>
           <w:sz w:val="24"/>
         </w:rPr>
-        <w:t>• Tool-Enabled Knowledge Grounding: Integrate an external tool (read_lore) so the agent dynamically cites accurate project attributes (developer name, engine stack, story).</w:t>
+        <w:t>Tool-Enabled Knowledge Grounding: Integrate an external tool (read_lore) so the agent dynamically cites accurate project attributes (developer name, engine stack, story).</w:t>
       </w:r>
     </w:p>
     <w:p>
       <w:pPr>
-        <w:spacing w:before="0" w:after="120" w:line="360" w:lineRule="auto"/>
-        <w:ind w:firstLine="576"/>
+        <w:spacing w:before="20" w:after="80" w:line="324" w:lineRule="auto"/>
+        <w:ind w:left="432" w:hanging="432"/>
         <w:jc w:val="both"/>
       </w:pPr>
+      <w:r>
+        <w:rPr>
+          <w:rFonts w:ascii="Times New Roman" w:hAnsi="Times New Roman"/>
+          <w:b/>
+          <w:i w:val="0"/>
+          <w:color w:val="000000"/>
+          <w:sz w:val="24"/>
+        </w:rPr>
+        <w:t>•</w:t>
+        <w:tab/>
+      </w:r>
       <w:r>
         <w:rPr>
           <w:rFonts w:ascii="Times New Roman" w:hAnsi="Times New Roman"/>
@@ -1083,15 +1176,26 @@
           <w:color w:val="000000"/>
           <w:sz w:val="24"/>
         </w:rPr>
-        <w:t>• Memory Retention: Support continuous multi-turn dialogue history.</w:t>
+        <w:t>Memory Retention: Support continuous multi-turn dialogue history without context overflow.</w:t>
       </w:r>
     </w:p>
     <w:p>
       <w:pPr>
-        <w:spacing w:before="0" w:after="120" w:line="360" w:lineRule="auto"/>
-        <w:ind w:firstLine="576"/>
+        <w:spacing w:before="20" w:after="80" w:line="324" w:lineRule="auto"/>
+        <w:ind w:left="432" w:hanging="432"/>
         <w:jc w:val="both"/>
       </w:pPr>
+      <w:r>
+        <w:rPr>
+          <w:rFonts w:ascii="Times New Roman" w:hAnsi="Times New Roman"/>
+          <w:b/>
+          <w:i w:val="0"/>
+          <w:color w:val="000000"/>
+          <w:sz w:val="24"/>
+        </w:rPr>
+        <w:t>•</w:t>
+        <w:tab/>
+      </w:r>
       <w:r>
         <w:rPr>
           <w:rFonts w:ascii="Times New Roman" w:hAnsi="Times New Roman"/>
@@ -1100,7 +1204,7 @@
           <w:color w:val="000000"/>
           <w:sz w:val="24"/>
         </w:rPr>
-        <w:t>• Deployment Versatility: Ensure cross-environment execution across local containerized FastAPI and serverless GitHub Pages.</w:t>
+        <w:t>Deployment Versatility: Ensure cross-environment execution across local containerized FastAPI and serverless GitHub Pages.</w:t>
       </w:r>
     </w:p>
     <w:p>
@@ -1110,7 +1214,8 @@
     </w:p>
     <w:p>
       <w:pPr>
-        <w:spacing w:before="360" w:after="160" w:line="276" w:lineRule="auto"/>
+        <w:keepNext/>
+        <w:spacing w:before="320" w:after="120" w:line="276" w:lineRule="auto"/>
         <w:jc w:val="left"/>
       </w:pPr>
       <w:r>
@@ -1126,7 +1231,8 @@
     </w:p>
     <w:p>
       <w:pPr>
-        <w:spacing w:before="240" w:after="120" w:line="276" w:lineRule="auto"/>
+        <w:keepNext/>
+        <w:spacing w:before="200" w:after="80" w:line="276" w:lineRule="auto"/>
         <w:jc w:val="left"/>
       </w:pPr>
       <w:r>
@@ -1159,10 +1265,21 @@
     </w:p>
     <w:p>
       <w:pPr>
-        <w:spacing w:before="0" w:after="120" w:line="360" w:lineRule="auto"/>
-        <w:ind w:firstLine="576"/>
+        <w:spacing w:before="20" w:after="80" w:line="324" w:lineRule="auto"/>
+        <w:ind w:left="432" w:hanging="432"/>
         <w:jc w:val="both"/>
       </w:pPr>
+      <w:r>
+        <w:rPr>
+          <w:rFonts w:ascii="Times New Roman" w:hAnsi="Times New Roman"/>
+          <w:b/>
+          <w:i w:val="0"/>
+          <w:color w:val="000000"/>
+          <w:sz w:val="24"/>
+        </w:rPr>
+        <w:t>1.</w:t>
+        <w:tab/>
+      </w:r>
       <w:r>
         <w:rPr>
           <w:rFonts w:ascii="Times New Roman" w:hAnsi="Times New Roman"/>
@@ -1171,15 +1288,26 @@
           <w:color w:val="000000"/>
           <w:sz w:val="24"/>
         </w:rPr>
-        <w:t>1. Rule-Based Systems: Relying on regular expressions and keyword lookup tables (as developed in Practical 3). While deterministic, they cannot generalize beyond predefined strings.</w:t>
+        <w:t>Rule-Based Systems: Relying on regular expressions and keyword lookup tables (as developed in Practical 3). While deterministic, they cannot generalize beyond predefined strings.</w:t>
       </w:r>
     </w:p>
     <w:p>
       <w:pPr>
-        <w:spacing w:before="0" w:after="120" w:line="360" w:lineRule="auto"/>
-        <w:ind w:firstLine="576"/>
+        <w:spacing w:before="20" w:after="80" w:line="324" w:lineRule="auto"/>
+        <w:ind w:left="432" w:hanging="432"/>
         <w:jc w:val="both"/>
       </w:pPr>
+      <w:r>
+        <w:rPr>
+          <w:rFonts w:ascii="Times New Roman" w:hAnsi="Times New Roman"/>
+          <w:b/>
+          <w:i w:val="0"/>
+          <w:color w:val="000000"/>
+          <w:sz w:val="24"/>
+        </w:rPr>
+        <w:t>2.</w:t>
+        <w:tab/>
+      </w:r>
       <w:r>
         <w:rPr>
           <w:rFonts w:ascii="Times New Roman" w:hAnsi="Times New Roman"/>
@@ -1188,15 +1316,26 @@
           <w:color w:val="000000"/>
           <w:sz w:val="24"/>
         </w:rPr>
-        <w:t>2. Zero-Shot Prompt-Driven Agents: Employing base LLMs with structured prompts (Practical 4). These handle freeform input but lack live context or external information.</w:t>
+        <w:t>Zero-Shot Prompt-Driven Agents: Employing base LLMs with structured prompts (Practical 4). These handle freeform input but lack live context or external information.</w:t>
       </w:r>
     </w:p>
     <w:p>
       <w:pPr>
-        <w:spacing w:before="0" w:after="120" w:line="360" w:lineRule="auto"/>
-        <w:ind w:firstLine="576"/>
+        <w:spacing w:before="20" w:after="80" w:line="324" w:lineRule="auto"/>
+        <w:ind w:left="432" w:hanging="432"/>
         <w:jc w:val="both"/>
       </w:pPr>
+      <w:r>
+        <w:rPr>
+          <w:rFonts w:ascii="Times New Roman" w:hAnsi="Times New Roman"/>
+          <w:b/>
+          <w:i w:val="0"/>
+          <w:color w:val="000000"/>
+          <w:sz w:val="24"/>
+        </w:rPr>
+        <w:t>3.</w:t>
+        <w:tab/>
+      </w:r>
       <w:r>
         <w:rPr>
           <w:rFonts w:ascii="Times New Roman" w:hAnsi="Times New Roman"/>
@@ -1205,12 +1344,13 @@
           <w:color w:val="000000"/>
           <w:sz w:val="24"/>
         </w:rPr>
-        <w:t>3. Tool-Augmented Autonomous Agents: Incorporating function calling (Practical 6) and conversational state memory (Practical 5). The agent can assess user queries, decide whether external files or functions must be executed, and synthesize grounded answers.</w:t>
+        <w:t>Tool-Augmented Autonomous Agents: Incorporating function calling (Practical 6) and conversational state memory (Practical 5). The agent can assess user queries, decide whether external files or functions must be executed, and synthesize grounded answers.</w:t>
       </w:r>
     </w:p>
     <w:p>
       <w:pPr>
-        <w:spacing w:before="240" w:after="120" w:line="276" w:lineRule="auto"/>
+        <w:keepNext/>
+        <w:spacing w:before="200" w:after="80" w:line="276" w:lineRule="auto"/>
         <w:jc w:val="left"/>
       </w:pPr>
       <w:r>
@@ -1246,21 +1386,38 @@
         <w:tblW w:type="auto" w:w="0"/>
         <w:jc w:val="center"/>
         <w:tblLook w:firstColumn="1" w:firstRow="1" w:lastColumn="0" w:lastRow="0" w:noHBand="0" w:noVBand="1" w:val="04A0"/>
+        <w:tblBorders>
+          <w:top w:val="single" w:sz="4" w:space="0" w:color="94A3B8"/>
+          <w:bottom w:val="single" w:sz="4" w:space="0" w:color="94A3B8"/>
+          <w:left w:val="none"/>
+          <w:right w:val="none"/>
+          <w:insideH w:val="single" w:sz="4" w:space="0" w:color="94A3B8"/>
+          <w:insideV w:val="none"/>
+        </w:tblBorders>
       </w:tblPr>
       <w:tblGrid>
-        <w:gridCol w:w="2890"/>
-        <w:gridCol w:w="2890"/>
-        <w:gridCol w:w="2890"/>
+        <w:gridCol w:w="2160"/>
+        <w:gridCol w:w="2448"/>
+        <w:gridCol w:w="4032"/>
       </w:tblGrid>
       <w:tr>
         <w:tc>
           <w:tcPr>
             <w:tcW w:type="dxa" w:w="2890"/>
+            <w:shd w:fill="E2E8F0"/>
+            <w:tcMar>
+              <w:top w:w="80" w:type="dxa"/>
+              <w:bottom w:w="80" w:type="dxa"/>
+              <w:left w:w="120" w:type="dxa"/>
+              <w:right w:w="120" w:type="dxa"/>
+            </w:tcMar>
           </w:tcPr>
           <w:p>
             <w:r>
               <w:rPr>
+                <w:rFonts w:ascii="Times New Roman" w:hAnsi="Times New Roman"/>
                 <w:b/>
+                <w:sz w:val="21"/>
               </w:rPr>
               <w:t>Component</w:t>
             </w:r>
@@ -1269,11 +1426,20 @@
         <w:tc>
           <w:tcPr>
             <w:tcW w:type="dxa" w:w="2890"/>
+            <w:shd w:fill="E2E8F0"/>
+            <w:tcMar>
+              <w:top w:w="80" w:type="dxa"/>
+              <w:bottom w:w="80" w:type="dxa"/>
+              <w:left w:w="120" w:type="dxa"/>
+              <w:right w:w="120" w:type="dxa"/>
+            </w:tcMar>
           </w:tcPr>
           <w:p>
             <w:r>
               <w:rPr>
+                <w:rFonts w:ascii="Times New Roman" w:hAnsi="Times New Roman"/>
                 <w:b/>
+                <w:sz w:val="21"/>
               </w:rPr>
               <w:t>Technology / Tool</w:t>
             </w:r>
@@ -1282,11 +1448,20 @@
         <w:tc>
           <w:tcPr>
             <w:tcW w:type="dxa" w:w="2890"/>
+            <w:shd w:fill="E2E8F0"/>
+            <w:tcMar>
+              <w:top w:w="80" w:type="dxa"/>
+              <w:bottom w:w="80" w:type="dxa"/>
+              <w:left w:w="120" w:type="dxa"/>
+              <w:right w:w="120" w:type="dxa"/>
+            </w:tcMar>
           </w:tcPr>
           <w:p>
             <w:r>
               <w:rPr>
+                <w:rFonts w:ascii="Times New Roman" w:hAnsi="Times New Roman"/>
                 <w:b/>
+                <w:sz w:val="21"/>
               </w:rPr>
               <w:t>Role in Project</w:t>
             </w:r>
@@ -1296,16 +1471,22 @@
       <w:tr>
         <w:tc>
           <w:tcPr>
-            <w:tcW w:type="dxa" w:w="2890"/>
+            <w:tcW w:type="dxa" w:w="2160"/>
+            <w:tcMar>
+              <w:top w:w="60" w:type="dxa"/>
+              <w:bottom w:w="60" w:type="dxa"/>
+              <w:left w:w="120" w:type="dxa"/>
+              <w:right w:w="120" w:type="dxa"/>
+            </w:tcMar>
           </w:tcPr>
           <w:p>
             <w:pPr>
-              <w:spacing w:line="276" w:lineRule="auto" w:after="60" w:before="60"/>
+              <w:spacing w:line="276" w:lineRule="auto" w:after="40" w:before="40"/>
             </w:pPr>
             <w:r>
               <w:rPr>
                 <w:rFonts w:ascii="Times New Roman" w:hAnsi="Times New Roman"/>
-                <w:sz w:val="20"/>
+                <w:sz w:val="19"/>
               </w:rPr>
               <w:t>Programming Language</w:t>
             </w:r>
@@ -1313,33 +1494,45 @@
         </w:tc>
         <w:tc>
           <w:tcPr>
-            <w:tcW w:type="dxa" w:w="2890"/>
+            <w:tcW w:type="dxa" w:w="2448"/>
+            <w:tcMar>
+              <w:top w:w="60" w:type="dxa"/>
+              <w:bottom w:w="60" w:type="dxa"/>
+              <w:left w:w="120" w:type="dxa"/>
+              <w:right w:w="120" w:type="dxa"/>
+            </w:tcMar>
           </w:tcPr>
           <w:p>
             <w:pPr>
-              <w:spacing w:line="276" w:lineRule="auto" w:after="60" w:before="60"/>
+              <w:spacing w:line="276" w:lineRule="auto" w:after="40" w:before="40"/>
             </w:pPr>
             <w:r>
               <w:rPr>
                 <w:rFonts w:ascii="Times New Roman" w:hAnsi="Times New Roman"/>
-                <w:sz w:val="20"/>
+                <w:sz w:val="19"/>
               </w:rPr>
-              <w:t>Python 3.12 &amp; JavaScript (ES6+)</w:t>
+              <w:t>Python 3.12 &amp; JavaScript</w:t>
             </w:r>
           </w:p>
         </w:tc>
         <w:tc>
           <w:tcPr>
-            <w:tcW w:type="dxa" w:w="2890"/>
+            <w:tcW w:type="dxa" w:w="4032"/>
+            <w:tcMar>
+              <w:top w:w="60" w:type="dxa"/>
+              <w:bottom w:w="60" w:type="dxa"/>
+              <w:left w:w="120" w:type="dxa"/>
+              <w:right w:w="120" w:type="dxa"/>
+            </w:tcMar>
           </w:tcPr>
           <w:p>
             <w:pPr>
-              <w:spacing w:line="276" w:lineRule="auto" w:after="60" w:before="60"/>
+              <w:spacing w:line="276" w:lineRule="auto" w:after="40" w:before="40"/>
             </w:pPr>
             <w:r>
               <w:rPr>
                 <w:rFonts w:ascii="Times New Roman" w:hAnsi="Times New Roman"/>
-                <w:sz w:val="20"/>
+                <w:sz w:val="19"/>
               </w:rPr>
               <w:t>Core agent logic, backend endpoints, and client-side web application.</w:t>
             </w:r>
@@ -1349,16 +1542,22 @@
       <w:tr>
         <w:tc>
           <w:tcPr>
-            <w:tcW w:type="dxa" w:w="2890"/>
+            <w:tcW w:type="dxa" w:w="2160"/>
+            <w:tcMar>
+              <w:top w:w="60" w:type="dxa"/>
+              <w:bottom w:w="60" w:type="dxa"/>
+              <w:left w:w="120" w:type="dxa"/>
+              <w:right w:w="120" w:type="dxa"/>
+            </w:tcMar>
           </w:tcPr>
           <w:p>
             <w:pPr>
-              <w:spacing w:line="276" w:lineRule="auto" w:after="60" w:before="60"/>
+              <w:spacing w:line="276" w:lineRule="auto" w:after="40" w:before="40"/>
             </w:pPr>
             <w:r>
               <w:rPr>
                 <w:rFonts w:ascii="Times New Roman" w:hAnsi="Times New Roman"/>
-                <w:sz w:val="20"/>
+                <w:sz w:val="19"/>
               </w:rPr>
               <w:t>LLM Inference Engine</w:t>
             </w:r>
@@ -1366,33 +1565,45 @@
         </w:tc>
         <w:tc>
           <w:tcPr>
-            <w:tcW w:type="dxa" w:w="2890"/>
+            <w:tcW w:type="dxa" w:w="2448"/>
+            <w:tcMar>
+              <w:top w:w="60" w:type="dxa"/>
+              <w:bottom w:w="60" w:type="dxa"/>
+              <w:left w:w="120" w:type="dxa"/>
+              <w:right w:w="120" w:type="dxa"/>
+            </w:tcMar>
           </w:tcPr>
           <w:p>
             <w:pPr>
-              <w:spacing w:line="276" w:lineRule="auto" w:after="60" w:before="60"/>
+              <w:spacing w:line="276" w:lineRule="auto" w:after="40" w:before="40"/>
             </w:pPr>
             <w:r>
               <w:rPr>
                 <w:rFonts w:ascii="Times New Roman" w:hAnsi="Times New Roman"/>
-                <w:sz w:val="20"/>
+                <w:sz w:val="19"/>
               </w:rPr>
-              <w:t>Groq Cloud LPU / openai/gpt-oss-20b</w:t>
+              <w:t>Groq Cloud / openai/gpt-oss-20b</w:t>
             </w:r>
           </w:p>
         </w:tc>
         <w:tc>
           <w:tcPr>
-            <w:tcW w:type="dxa" w:w="2890"/>
+            <w:tcW w:type="dxa" w:w="4032"/>
+            <w:tcMar>
+              <w:top w:w="60" w:type="dxa"/>
+              <w:bottom w:w="60" w:type="dxa"/>
+              <w:left w:w="120" w:type="dxa"/>
+              <w:right w:w="120" w:type="dxa"/>
+            </w:tcMar>
           </w:tcPr>
           <w:p>
             <w:pPr>
-              <w:spacing w:line="276" w:lineRule="auto" w:after="60" w:before="60"/>
+              <w:spacing w:line="276" w:lineRule="auto" w:after="40" w:before="40"/>
             </w:pPr>
             <w:r>
               <w:rPr>
                 <w:rFonts w:ascii="Times New Roman" w:hAnsi="Times New Roman"/>
-                <w:sz w:val="20"/>
+                <w:sz w:val="19"/>
               </w:rPr>
               <w:t>High-speed inference offering sub-second latency with tool-calling capabilities.</w:t>
             </w:r>
@@ -1402,16 +1613,22 @@
       <w:tr>
         <w:tc>
           <w:tcPr>
-            <w:tcW w:type="dxa" w:w="2890"/>
+            <w:tcW w:type="dxa" w:w="2160"/>
+            <w:tcMar>
+              <w:top w:w="60" w:type="dxa"/>
+              <w:bottom w:w="60" w:type="dxa"/>
+              <w:left w:w="120" w:type="dxa"/>
+              <w:right w:w="120" w:type="dxa"/>
+            </w:tcMar>
           </w:tcPr>
           <w:p>
             <w:pPr>
-              <w:spacing w:line="276" w:lineRule="auto" w:after="60" w:before="60"/>
+              <w:spacing w:line="276" w:lineRule="auto" w:after="40" w:before="40"/>
             </w:pPr>
             <w:r>
               <w:rPr>
                 <w:rFonts w:ascii="Times New Roman" w:hAnsi="Times New Roman"/>
-                <w:sz w:val="20"/>
+                <w:sz w:val="19"/>
               </w:rPr>
               <w:t>Backend Framework</w:t>
             </w:r>
@@ -1419,16 +1636,22 @@
         </w:tc>
         <w:tc>
           <w:tcPr>
-            <w:tcW w:type="dxa" w:w="2890"/>
+            <w:tcW w:type="dxa" w:w="2448"/>
+            <w:tcMar>
+              <w:top w:w="60" w:type="dxa"/>
+              <w:bottom w:w="60" w:type="dxa"/>
+              <w:left w:w="120" w:type="dxa"/>
+              <w:right w:w="120" w:type="dxa"/>
+            </w:tcMar>
           </w:tcPr>
           <w:p>
             <w:pPr>
-              <w:spacing w:line="276" w:lineRule="auto" w:after="60" w:before="60"/>
+              <w:spacing w:line="276" w:lineRule="auto" w:after="40" w:before="40"/>
             </w:pPr>
             <w:r>
               <w:rPr>
                 <w:rFonts w:ascii="Times New Roman" w:hAnsi="Times New Roman"/>
-                <w:sz w:val="20"/>
+                <w:sz w:val="19"/>
               </w:rPr>
               <w:t>FastAPI 0.100+ &amp; Uvicorn 0.23+</w:t>
             </w:r>
@@ -1436,16 +1659,22 @@
         </w:tc>
         <w:tc>
           <w:tcPr>
-            <w:tcW w:type="dxa" w:w="2890"/>
+            <w:tcW w:type="dxa" w:w="4032"/>
+            <w:tcMar>
+              <w:top w:w="60" w:type="dxa"/>
+              <w:bottom w:w="60" w:type="dxa"/>
+              <w:left w:w="120" w:type="dxa"/>
+              <w:right w:w="120" w:type="dxa"/>
+            </w:tcMar>
           </w:tcPr>
           <w:p>
             <w:pPr>
-              <w:spacing w:line="276" w:lineRule="auto" w:after="60" w:before="60"/>
+              <w:spacing w:line="276" w:lineRule="auto" w:after="40" w:before="40"/>
             </w:pPr>
             <w:r>
               <w:rPr>
                 <w:rFonts w:ascii="Times New Roman" w:hAnsi="Times New Roman"/>
-                <w:sz w:val="20"/>
+                <w:sz w:val="19"/>
               </w:rPr>
               <w:t>Asynchronous REST API endpoints (/chat and /clear) with CORS handling.</w:t>
             </w:r>
@@ -1455,16 +1684,22 @@
       <w:tr>
         <w:tc>
           <w:tcPr>
-            <w:tcW w:type="dxa" w:w="2890"/>
+            <w:tcW w:type="dxa" w:w="2160"/>
+            <w:tcMar>
+              <w:top w:w="60" w:type="dxa"/>
+              <w:bottom w:w="60" w:type="dxa"/>
+              <w:left w:w="120" w:type="dxa"/>
+              <w:right w:w="120" w:type="dxa"/>
+            </w:tcMar>
           </w:tcPr>
           <w:p>
             <w:pPr>
-              <w:spacing w:line="276" w:lineRule="auto" w:after="60" w:before="60"/>
+              <w:spacing w:line="276" w:lineRule="auto" w:after="40" w:before="40"/>
             </w:pPr>
             <w:r>
               <w:rPr>
                 <w:rFonts w:ascii="Times New Roman" w:hAnsi="Times New Roman"/>
-                <w:sz w:val="20"/>
+                <w:sz w:val="19"/>
               </w:rPr>
               <w:t>Frontend Architecture</w:t>
             </w:r>
@@ -1472,33 +1707,45 @@
         </w:tc>
         <w:tc>
           <w:tcPr>
-            <w:tcW w:type="dxa" w:w="2890"/>
+            <w:tcW w:type="dxa" w:w="2448"/>
+            <w:tcMar>
+              <w:top w:w="60" w:type="dxa"/>
+              <w:bottom w:w="60" w:type="dxa"/>
+              <w:left w:w="120" w:type="dxa"/>
+              <w:right w:w="120" w:type="dxa"/>
+            </w:tcMar>
           </w:tcPr>
           <w:p>
             <w:pPr>
-              <w:spacing w:line="276" w:lineRule="auto" w:after="60" w:before="60"/>
+              <w:spacing w:line="276" w:lineRule="auto" w:after="40" w:before="40"/>
             </w:pPr>
             <w:r>
               <w:rPr>
                 <w:rFonts w:ascii="Times New Roman" w:hAnsi="Times New Roman"/>
-                <w:sz w:val="20"/>
+                <w:sz w:val="19"/>
               </w:rPr>
-              <w:t>HTML5, CSS3 Custom Properties, Vanilla JS</w:t>
+              <w:t>HTML5, CSS3, Vanilla JS</w:t>
             </w:r>
           </w:p>
         </w:tc>
         <w:tc>
           <w:tcPr>
-            <w:tcW w:type="dxa" w:w="2890"/>
+            <w:tcW w:type="dxa" w:w="4032"/>
+            <w:tcMar>
+              <w:top w:w="60" w:type="dxa"/>
+              <w:bottom w:w="60" w:type="dxa"/>
+              <w:left w:w="120" w:type="dxa"/>
+              <w:right w:w="120" w:type="dxa"/>
+            </w:tcMar>
           </w:tcPr>
           <w:p>
             <w:pPr>
-              <w:spacing w:line="276" w:lineRule="auto" w:after="60" w:before="60"/>
+              <w:spacing w:line="276" w:lineRule="auto" w:after="40" w:before="40"/>
             </w:pPr>
             <w:r>
               <w:rPr>
                 <w:rFonts w:ascii="Times New Roman" w:hAnsi="Times New Roman"/>
-                <w:sz w:val="20"/>
+                <w:sz w:val="19"/>
               </w:rPr>
               <w:t>Light/Dark theme rendering, RPG HUD, inventory panel, and dialogue boxes.</w:t>
             </w:r>
@@ -1508,16 +1755,22 @@
       <w:tr>
         <w:tc>
           <w:tcPr>
-            <w:tcW w:type="dxa" w:w="2890"/>
+            <w:tcW w:type="dxa" w:w="2160"/>
+            <w:tcMar>
+              <w:top w:w="60" w:type="dxa"/>
+              <w:bottom w:w="60" w:type="dxa"/>
+              <w:left w:w="120" w:type="dxa"/>
+              <w:right w:w="120" w:type="dxa"/>
+            </w:tcMar>
           </w:tcPr>
           <w:p>
             <w:pPr>
-              <w:spacing w:line="276" w:lineRule="auto" w:after="60" w:before="60"/>
+              <w:spacing w:line="276" w:lineRule="auto" w:after="40" w:before="40"/>
             </w:pPr>
             <w:r>
               <w:rPr>
                 <w:rFonts w:ascii="Times New Roman" w:hAnsi="Times New Roman"/>
-                <w:sz w:val="20"/>
+                <w:sz w:val="19"/>
               </w:rPr>
               <w:t>Audio Synthesizer</w:t>
             </w:r>
@@ -1525,16 +1778,22 @@
         </w:tc>
         <w:tc>
           <w:tcPr>
-            <w:tcW w:type="dxa" w:w="2890"/>
+            <w:tcW w:type="dxa" w:w="2448"/>
+            <w:tcMar>
+              <w:top w:w="60" w:type="dxa"/>
+              <w:bottom w:w="60" w:type="dxa"/>
+              <w:left w:w="120" w:type="dxa"/>
+              <w:right w:w="120" w:type="dxa"/>
+            </w:tcMar>
           </w:tcPr>
           <w:p>
             <w:pPr>
-              <w:spacing w:line="276" w:lineRule="auto" w:after="60" w:before="60"/>
+              <w:spacing w:line="276" w:lineRule="auto" w:after="40" w:before="40"/>
             </w:pPr>
             <w:r>
               <w:rPr>
                 <w:rFonts w:ascii="Times New Roman" w:hAnsi="Times New Roman"/>
-                <w:sz w:val="20"/>
+                <w:sz w:val="19"/>
               </w:rPr>
               <w:t>Web Audio API</w:t>
             </w:r>
@@ -1542,16 +1801,22 @@
         </w:tc>
         <w:tc>
           <w:tcPr>
-            <w:tcW w:type="dxa" w:w="2890"/>
+            <w:tcW w:type="dxa" w:w="4032"/>
+            <w:tcMar>
+              <w:top w:w="60" w:type="dxa"/>
+              <w:bottom w:w="60" w:type="dxa"/>
+              <w:left w:w="120" w:type="dxa"/>
+              <w:right w:w="120" w:type="dxa"/>
+            </w:tcMar>
           </w:tcPr>
           <w:p>
             <w:pPr>
-              <w:spacing w:line="276" w:lineRule="auto" w:after="60" w:before="60"/>
+              <w:spacing w:line="276" w:lineRule="auto" w:after="40" w:before="40"/>
             </w:pPr>
             <w:r>
               <w:rPr>
                 <w:rFonts w:ascii="Times New Roman" w:hAnsi="Times New Roman"/>
-                <w:sz w:val="20"/>
+                <w:sz w:val="19"/>
               </w:rPr>
               <w:t>Real-time programmatic 8-bit sound synthesizers for send/receive audio feedback.</w:t>
             </w:r>
@@ -1561,16 +1826,22 @@
       <w:tr>
         <w:tc>
           <w:tcPr>
-            <w:tcW w:type="dxa" w:w="2890"/>
+            <w:tcW w:type="dxa" w:w="2160"/>
+            <w:tcMar>
+              <w:top w:w="60" w:type="dxa"/>
+              <w:bottom w:w="60" w:type="dxa"/>
+              <w:left w:w="120" w:type="dxa"/>
+              <w:right w:w="120" w:type="dxa"/>
+            </w:tcMar>
           </w:tcPr>
           <w:p>
             <w:pPr>
-              <w:spacing w:line="276" w:lineRule="auto" w:after="60" w:before="60"/>
+              <w:spacing w:line="276" w:lineRule="auto" w:after="40" w:before="40"/>
             </w:pPr>
             <w:r>
               <w:rPr>
                 <w:rFonts w:ascii="Times New Roman" w:hAnsi="Times New Roman"/>
-                <w:sz w:val="20"/>
+                <w:sz w:val="19"/>
               </w:rPr>
               <w:t>Voice Speech Engine</w:t>
             </w:r>
@@ -1578,33 +1849,45 @@
         </w:tc>
         <w:tc>
           <w:tcPr>
-            <w:tcW w:type="dxa" w:w="2890"/>
+            <w:tcW w:type="dxa" w:w="2448"/>
+            <w:tcMar>
+              <w:top w:w="60" w:type="dxa"/>
+              <w:bottom w:w="60" w:type="dxa"/>
+              <w:left w:w="120" w:type="dxa"/>
+              <w:right w:w="120" w:type="dxa"/>
+            </w:tcMar>
           </w:tcPr>
           <w:p>
             <w:pPr>
-              <w:spacing w:line="276" w:lineRule="auto" w:after="60" w:before="60"/>
+              <w:spacing w:line="276" w:lineRule="auto" w:after="40" w:before="40"/>
             </w:pPr>
             <w:r>
               <w:rPr>
                 <w:rFonts w:ascii="Times New Roman" w:hAnsi="Times New Roman"/>
-                <w:sz w:val="20"/>
+                <w:sz w:val="19"/>
               </w:rPr>
-              <w:t>Web Speech API (SpeechSynthesis)</w:t>
+              <w:t>Web Speech API (TTS)</w:t>
             </w:r>
           </w:p>
         </w:tc>
         <w:tc>
           <w:tcPr>
-            <w:tcW w:type="dxa" w:w="2890"/>
+            <w:tcW w:type="dxa" w:w="4032"/>
+            <w:tcMar>
+              <w:top w:w="60" w:type="dxa"/>
+              <w:bottom w:w="60" w:type="dxa"/>
+              <w:left w:w="120" w:type="dxa"/>
+              <w:right w:w="120" w:type="dxa"/>
+            </w:tcMar>
           </w:tcPr>
           <w:p>
             <w:pPr>
-              <w:spacing w:line="276" w:lineRule="auto" w:after="60" w:before="60"/>
+              <w:spacing w:line="276" w:lineRule="auto" w:after="40" w:before="40"/>
             </w:pPr>
             <w:r>
               <w:rPr>
                 <w:rFonts w:ascii="Times New Roman" w:hAnsi="Times New Roman"/>
-                <w:sz w:val="20"/>
+                <w:sz w:val="19"/>
               </w:rPr>
               <w:t>Real-time voice narration for the NPC dialogue without external audio files.</w:t>
             </w:r>
@@ -1614,16 +1897,22 @@
       <w:tr>
         <w:tc>
           <w:tcPr>
-            <w:tcW w:type="dxa" w:w="2890"/>
+            <w:tcW w:type="dxa" w:w="2160"/>
+            <w:tcMar>
+              <w:top w:w="60" w:type="dxa"/>
+              <w:bottom w:w="60" w:type="dxa"/>
+              <w:left w:w="120" w:type="dxa"/>
+              <w:right w:w="120" w:type="dxa"/>
+            </w:tcMar>
           </w:tcPr>
           <w:p>
             <w:pPr>
-              <w:spacing w:line="276" w:lineRule="auto" w:after="60" w:before="60"/>
+              <w:spacing w:line="276" w:lineRule="auto" w:after="40" w:before="40"/>
             </w:pPr>
             <w:r>
               <w:rPr>
                 <w:rFonts w:ascii="Times New Roman" w:hAnsi="Times New Roman"/>
-                <w:sz w:val="20"/>
+                <w:sz w:val="19"/>
               </w:rPr>
               <w:t>Containerization</w:t>
             </w:r>
@@ -1631,16 +1920,22 @@
         </w:tc>
         <w:tc>
           <w:tcPr>
-            <w:tcW w:type="dxa" w:w="2890"/>
+            <w:tcW w:type="dxa" w:w="2448"/>
+            <w:tcMar>
+              <w:top w:w="60" w:type="dxa"/>
+              <w:bottom w:w="60" w:type="dxa"/>
+              <w:left w:w="120" w:type="dxa"/>
+              <w:right w:w="120" w:type="dxa"/>
+            </w:tcMar>
           </w:tcPr>
           <w:p>
             <w:pPr>
-              <w:spacing w:line="276" w:lineRule="auto" w:after="60" w:before="60"/>
+              <w:spacing w:line="276" w:lineRule="auto" w:after="40" w:before="40"/>
             </w:pPr>
             <w:r>
               <w:rPr>
                 <w:rFonts w:ascii="Times New Roman" w:hAnsi="Times New Roman"/>
-                <w:sz w:val="20"/>
+                <w:sz w:val="19"/>
               </w:rPr>
               <w:t>Docker (python:3.9-slim)</w:t>
             </w:r>
@@ -1648,16 +1943,22 @@
         </w:tc>
         <w:tc>
           <w:tcPr>
-            <w:tcW w:type="dxa" w:w="2890"/>
+            <w:tcW w:type="dxa" w:w="4032"/>
+            <w:tcMar>
+              <w:top w:w="60" w:type="dxa"/>
+              <w:bottom w:w="60" w:type="dxa"/>
+              <w:left w:w="120" w:type="dxa"/>
+              <w:right w:w="120" w:type="dxa"/>
+            </w:tcMar>
           </w:tcPr>
           <w:p>
             <w:pPr>
-              <w:spacing w:line="276" w:lineRule="auto" w:after="60" w:before="60"/>
+              <w:spacing w:line="276" w:lineRule="auto" w:after="40" w:before="40"/>
             </w:pPr>
             <w:r>
               <w:rPr>
                 <w:rFonts w:ascii="Times New Roman" w:hAnsi="Times New Roman"/>
-                <w:sz w:val="20"/>
+                <w:sz w:val="19"/>
               </w:rPr>
               <w:t>Standard production containerization exposing cloud port 7860.</w:t>
             </w:r>
@@ -1667,16 +1968,22 @@
       <w:tr>
         <w:tc>
           <w:tcPr>
-            <w:tcW w:type="dxa" w:w="2890"/>
+            <w:tcW w:type="dxa" w:w="2160"/>
+            <w:tcMar>
+              <w:top w:w="60" w:type="dxa"/>
+              <w:bottom w:w="60" w:type="dxa"/>
+              <w:left w:w="120" w:type="dxa"/>
+              <w:right w:w="120" w:type="dxa"/>
+            </w:tcMar>
           </w:tcPr>
           <w:p>
             <w:pPr>
-              <w:spacing w:line="276" w:lineRule="auto" w:after="60" w:before="60"/>
+              <w:spacing w:line="276" w:lineRule="auto" w:after="40" w:before="40"/>
             </w:pPr>
             <w:r>
               <w:rPr>
                 <w:rFonts w:ascii="Times New Roman" w:hAnsi="Times New Roman"/>
-                <w:sz w:val="20"/>
+                <w:sz w:val="19"/>
               </w:rPr>
               <w:t>Cloud Deployment</w:t>
             </w:r>
@@ -1684,16 +1991,22 @@
         </w:tc>
         <w:tc>
           <w:tcPr>
-            <w:tcW w:type="dxa" w:w="2890"/>
+            <w:tcW w:type="dxa" w:w="2448"/>
+            <w:tcMar>
+              <w:top w:w="60" w:type="dxa"/>
+              <w:bottom w:w="60" w:type="dxa"/>
+              <w:left w:w="120" w:type="dxa"/>
+              <w:right w:w="120" w:type="dxa"/>
+            </w:tcMar>
           </w:tcPr>
           <w:p>
             <w:pPr>
-              <w:spacing w:line="276" w:lineRule="auto" w:after="60" w:before="60"/>
+              <w:spacing w:line="276" w:lineRule="auto" w:after="40" w:before="40"/>
             </w:pPr>
             <w:r>
               <w:rPr>
                 <w:rFonts w:ascii="Times New Roman" w:hAnsi="Times New Roman"/>
-                <w:sz w:val="20"/>
+                <w:sz w:val="19"/>
               </w:rPr>
               <w:t>GitHub Pages / Git VCS</w:t>
             </w:r>
@@ -1701,16 +2014,22 @@
         </w:tc>
         <w:tc>
           <w:tcPr>
-            <w:tcW w:type="dxa" w:w="2890"/>
+            <w:tcW w:type="dxa" w:w="4032"/>
+            <w:tcMar>
+              <w:top w:w="60" w:type="dxa"/>
+              <w:bottom w:w="60" w:type="dxa"/>
+              <w:left w:w="120" w:type="dxa"/>
+              <w:right w:w="120" w:type="dxa"/>
+            </w:tcMar>
           </w:tcPr>
           <w:p>
             <w:pPr>
-              <w:spacing w:line="276" w:lineRule="auto" w:after="60" w:before="60"/>
+              <w:spacing w:line="276" w:lineRule="auto" w:after="40" w:before="40"/>
             </w:pPr>
             <w:r>
               <w:rPr>
                 <w:rFonts w:ascii="Times New Roman" w:hAnsi="Times New Roman"/>
-                <w:sz w:val="20"/>
+                <w:sz w:val="19"/>
               </w:rPr>
               <w:t>Live public hosting of the serverless interactive AI application.</w:t>
             </w:r>
@@ -1725,7 +2044,8 @@
     </w:p>
     <w:p>
       <w:pPr>
-        <w:spacing w:before="360" w:after="160" w:line="276" w:lineRule="auto"/>
+        <w:keepNext/>
+        <w:spacing w:before="320" w:after="120" w:line="276" w:lineRule="auto"/>
         <w:jc w:val="left"/>
       </w:pPr>
       <w:r>
@@ -1741,7 +2061,8 @@
     </w:p>
     <w:p>
       <w:pPr>
-        <w:spacing w:before="240" w:after="120" w:line="276" w:lineRule="auto"/>
+        <w:keepNext/>
+        <w:spacing w:before="200" w:after="80" w:line="276" w:lineRule="auto"/>
         <w:jc w:val="left"/>
       </w:pPr>
       <w:r>
@@ -1773,10 +2094,14 @@
       </w:r>
     </w:p>
     <w:p>
+      <w:pPr>
+        <w:spacing w:before="80" w:after="80"/>
+        <w:jc w:val="center"/>
+      </w:pPr>
       <w:r>
         <w:drawing>
           <wp:inline xmlns:a="http://schemas.openxmlformats.org/drawingml/2006/main" xmlns:pic="http://schemas.openxmlformats.org/drawingml/2006/picture">
-            <wp:extent cx="5486400" cy="4114800"/>
+            <wp:extent cx="4937760" cy="3703320"/>
             <wp:docPr id="1" name="Picture 1"/>
             <wp:cNvGraphicFramePr>
               <a:graphicFrameLocks noChangeAspect="1"/>
@@ -1797,7 +2122,7 @@
                   <pic:spPr>
                     <a:xfrm>
                       <a:off x="0" y="0"/>
-                      <a:ext cx="5486400" cy="4114800"/>
+                      <a:ext cx="4937760" cy="3703320"/>
                     </a:xfrm>
                     <a:prstGeom prst="rect"/>
                   </pic:spPr>
@@ -1810,7 +2135,8 @@
     </w:p>
     <w:p>
       <w:pPr>
-        <w:spacing w:before="80" w:after="280" w:line="360" w:lineRule="auto"/>
+        <w:keepNext w:val="0"/>
+        <w:spacing w:before="40" w:after="200" w:line="360" w:lineRule="auto"/>
         <w:jc w:val="center"/>
       </w:pPr>
       <w:r>
@@ -1821,12 +2147,13 @@
           <w:color w:val="000000"/>
           <w:sz w:val="21"/>
         </w:rPr>
-        <w:t>Figure 3.1: Detailed System Architecture of the Chronicles of Prasa AI Agent</w:t>
+        <w:t>Figure 3.1: Layered System Architecture of the Chronicles of Prasa AI Agent</w:t>
       </w:r>
     </w:p>
     <w:p>
       <w:pPr>
-        <w:spacing w:before="240" w:after="120" w:line="276" w:lineRule="auto"/>
+        <w:keepNext/>
+        <w:spacing w:before="200" w:after="80" w:line="276" w:lineRule="auto"/>
         <w:jc w:val="left"/>
       </w:pPr>
       <w:r>
@@ -1854,15 +2181,26 @@
           <w:color w:val="000000"/>
           <w:sz w:val="24"/>
         </w:rPr>
-        <w:t>A core innovation in this project is the Dual-Execution Strategy:</w:t>
+        <w:t>A core architectural innovation in this project is the Dual-Execution Strategy:</w:t>
       </w:r>
     </w:p>
     <w:p>
       <w:pPr>
-        <w:spacing w:before="0" w:after="120" w:line="360" w:lineRule="auto"/>
-        <w:ind w:firstLine="576"/>
+        <w:spacing w:before="20" w:after="80" w:line="324" w:lineRule="auto"/>
+        <w:ind w:left="432" w:hanging="432"/>
         <w:jc w:val="both"/>
       </w:pPr>
+      <w:r>
+        <w:rPr>
+          <w:rFonts w:ascii="Times New Roman" w:hAnsi="Times New Roman"/>
+          <w:b/>
+          <w:i w:val="0"/>
+          <w:color w:val="000000"/>
+          <w:sz w:val="24"/>
+        </w:rPr>
+        <w:t>•</w:t>
+        <w:tab/>
+      </w:r>
       <w:r>
         <w:rPr>
           <w:rFonts w:ascii="Times New Roman" w:hAnsi="Times New Roman"/>
@@ -1871,15 +2209,26 @@
           <w:color w:val="000000"/>
           <w:sz w:val="24"/>
         </w:rPr>
-        <w:t>• Localhost Execution: When accessed on localhost or 127.0.0.1, the web application detects the local origin and routes all chat traffic to the FastAPI backend. The server accesses GROQ_API_KEY directly from the root .env file, removing the need for user key input.</w:t>
+        <w:t>Localhost Execution: When accessed on localhost or 127.0.0.1, the web application detects the local origin and routes all chat traffic to the FastAPI backend. The server accesses GROQ_API_KEY directly from the root .env file, removing the need for user key input.</w:t>
       </w:r>
     </w:p>
     <w:p>
       <w:pPr>
-        <w:spacing w:before="0" w:after="120" w:line="360" w:lineRule="auto"/>
-        <w:ind w:firstLine="576"/>
+        <w:spacing w:before="20" w:after="80" w:line="324" w:lineRule="auto"/>
+        <w:ind w:left="432" w:hanging="432"/>
         <w:jc w:val="both"/>
       </w:pPr>
+      <w:r>
+        <w:rPr>
+          <w:rFonts w:ascii="Times New Roman" w:hAnsi="Times New Roman"/>
+          <w:b/>
+          <w:i w:val="0"/>
+          <w:color w:val="000000"/>
+          <w:sz w:val="24"/>
+        </w:rPr>
+        <w:t>•</w:t>
+        <w:tab/>
+      </w:r>
       <w:r>
         <w:rPr>
           <w:rFonts w:ascii="Times New Roman" w:hAnsi="Times New Roman"/>
@@ -1888,7 +2237,7 @@
           <w:color w:val="000000"/>
           <w:sz w:val="24"/>
         </w:rPr>
-        <w:t>• Cloud Serverless Execution: When hosted on GitHub Pages (github.io), the app utilizes client-side fetch calls to Groq API. The user inputs their API key into a secure browser prompt stored solely in localStorage, ensuring zero key leakage to public repositories.</w:t>
+        <w:t>Cloud Serverless Execution: When hosted on GitHub Pages (github.io), the app utilizes client-side fetch calls to Groq API. The user inputs their API key into a secure browser prompt stored solely in localStorage, ensuring zero key leakage to public repositories.</w:t>
       </w:r>
     </w:p>
     <w:p>
@@ -1898,7 +2247,8 @@
     </w:p>
     <w:p>
       <w:pPr>
-        <w:spacing w:before="240" w:after="120" w:line="276" w:lineRule="auto"/>
+        <w:keepNext/>
+        <w:spacing w:before="200" w:after="80" w:line="276" w:lineRule="auto"/>
         <w:jc w:val="left"/>
       </w:pPr>
       <w:r>
@@ -1930,10 +2280,14 @@
       </w:r>
     </w:p>
     <w:p>
+      <w:pPr>
+        <w:spacing w:before="80" w:after="80"/>
+        <w:jc w:val="center"/>
+      </w:pPr>
       <w:r>
         <w:drawing>
           <wp:inline xmlns:a="http://schemas.openxmlformats.org/drawingml/2006/main" xmlns:pic="http://schemas.openxmlformats.org/drawingml/2006/picture">
-            <wp:extent cx="4389120" cy="5486400"/>
+            <wp:extent cx="3474720" cy="4343400"/>
             <wp:docPr id="2" name="Picture 2"/>
             <wp:cNvGraphicFramePr>
               <a:graphicFrameLocks noChangeAspect="1"/>
@@ -1954,7 +2308,7 @@
                   <pic:spPr>
                     <a:xfrm>
                       <a:off x="0" y="0"/>
-                      <a:ext cx="4389120" cy="5486400"/>
+                      <a:ext cx="3474720" cy="4343400"/>
                     </a:xfrm>
                     <a:prstGeom prst="rect"/>
                   </pic:spPr>
@@ -1967,7 +2321,7 @@
     </w:p>
     <w:p>
       <w:pPr>
-        <w:spacing w:before="80" w:after="280" w:line="360" w:lineRule="auto"/>
+        <w:spacing w:before="40" w:after="200" w:line="360" w:lineRule="auto"/>
         <w:jc w:val="center"/>
       </w:pPr>
       <w:r>
@@ -1983,7 +2337,8 @@
     </w:p>
     <w:p>
       <w:pPr>
-        <w:spacing w:before="240" w:after="120" w:line="276" w:lineRule="auto"/>
+        <w:keepNext/>
+        <w:spacing w:before="200" w:after="80" w:line="276" w:lineRule="auto"/>
         <w:jc w:val="left"/>
       </w:pPr>
       <w:r>
@@ -2015,10 +2370,14 @@
       </w:r>
     </w:p>
     <w:p>
+      <w:pPr>
+        <w:spacing w:before="80" w:after="80"/>
+        <w:jc w:val="center"/>
+      </w:pPr>
       <w:r>
         <w:drawing>
           <wp:inline xmlns:a="http://schemas.openxmlformats.org/drawingml/2006/main" xmlns:pic="http://schemas.openxmlformats.org/drawingml/2006/picture">
-            <wp:extent cx="5029200" cy="3632200"/>
+            <wp:extent cx="4572000" cy="3302000"/>
             <wp:docPr id="3" name="Picture 3"/>
             <wp:cNvGraphicFramePr>
               <a:graphicFrameLocks noChangeAspect="1"/>
@@ -2039,7 +2398,7 @@
                   <pic:spPr>
                     <a:xfrm>
                       <a:off x="0" y="0"/>
-                      <a:ext cx="5029200" cy="3632200"/>
+                      <a:ext cx="4572000" cy="3302000"/>
                     </a:xfrm>
                     <a:prstGeom prst="rect"/>
                   </pic:spPr>
@@ -2052,7 +2411,7 @@
     </w:p>
     <w:p>
       <w:pPr>
-        <w:spacing w:before="80" w:after="280" w:line="360" w:lineRule="auto"/>
+        <w:spacing w:before="40" w:after="200" w:line="360" w:lineRule="auto"/>
         <w:jc w:val="center"/>
       </w:pPr>
       <w:r>
@@ -2073,7 +2432,8 @@
     </w:p>
     <w:p>
       <w:pPr>
-        <w:spacing w:before="360" w:after="160" w:line="276" w:lineRule="auto"/>
+        <w:keepNext/>
+        <w:spacing w:before="320" w:after="120" w:line="276" w:lineRule="auto"/>
         <w:jc w:val="left"/>
       </w:pPr>
       <w:r>
@@ -2089,7 +2449,8 @@
     </w:p>
     <w:p>
       <w:pPr>
-        <w:spacing w:before="240" w:after="120" w:line="276" w:lineRule="auto"/>
+        <w:keepNext/>
+        <w:spacing w:before="200" w:after="80" w:line="276" w:lineRule="auto"/>
         <w:jc w:val="left"/>
       </w:pPr>
       <w:r>
@@ -2117,12 +2478,13 @@
           <w:color w:val="000000"/>
           <w:sz w:val="24"/>
         </w:rPr>
-        <w:t>The domain ground truth is defined in game_lore.txt. It acts as the immutable factual document containing project history, developer credits (Prasa), technical engine stack (Python, FastAPI, HTML/JS, Groq Core), and the narrative backstory of Aethelgard.</w:t>
+        <w:t>The domain ground truth is defined in game_lore.txt. It acts as the immutable factual document containing project history, developer credits (Prasa), technical engine stack (Python, FastAPI, HTML/JS, Groq Core), and the narrative backstory of Aethelgard. Separating lore from code allows game writers to modify narrative arcs without recompiling agent logic.</w:t>
       </w:r>
     </w:p>
     <w:p>
       <w:pPr>
-        <w:spacing w:before="240" w:after="120" w:line="276" w:lineRule="auto"/>
+        <w:keepNext/>
+        <w:spacing w:before="200" w:after="80" w:line="276" w:lineRule="auto"/>
         <w:jc w:val="left"/>
       </w:pPr>
       <w:r>
@@ -2155,7 +2517,8 @@
     </w:p>
     <w:p>
       <w:pPr>
-        <w:spacing w:before="240" w:after="120" w:line="276" w:lineRule="auto"/>
+        <w:keepNext/>
+        <w:spacing w:before="200" w:after="80" w:line="276" w:lineRule="auto"/>
         <w:jc w:val="left"/>
       </w:pPr>
       <w:r>
@@ -2188,10 +2551,21 @@
     </w:p>
     <w:p>
       <w:pPr>
-        <w:spacing w:before="0" w:after="120" w:line="360" w:lineRule="auto"/>
-        <w:ind w:firstLine="576"/>
+        <w:spacing w:before="20" w:after="80" w:line="324" w:lineRule="auto"/>
+        <w:ind w:left="432" w:hanging="432"/>
         <w:jc w:val="both"/>
       </w:pPr>
+      <w:r>
+        <w:rPr>
+          <w:rFonts w:ascii="Times New Roman" w:hAnsi="Times New Roman"/>
+          <w:b/>
+          <w:i w:val="0"/>
+          <w:color w:val="000000"/>
+          <w:sz w:val="24"/>
+        </w:rPr>
+        <w:t>1.</w:t>
+        <w:tab/>
+      </w:r>
       <w:r>
         <w:rPr>
           <w:rFonts w:ascii="Times New Roman" w:hAnsi="Times New Roman"/>
@@ -2200,15 +2574,26 @@
           <w:color w:val="000000"/>
           <w:sz w:val="24"/>
         </w:rPr>
-        <w:t>1. Illuminated Light Theme: Active by default with an antique parchment color scheme (#f7f3ea), warm gold borders (#b48a28), and high-contrast dark charcoal ink text (#291e14).</w:t>
+        <w:t>Illuminated Light Theme: Active by default with an antique parchment color scheme (#f7f3ea), warm gold borders (#b48a28), and high-contrast dark charcoal ink text (#291e14).</w:t>
       </w:r>
     </w:p>
     <w:p>
       <w:pPr>
-        <w:spacing w:before="0" w:after="120" w:line="360" w:lineRule="auto"/>
-        <w:ind w:firstLine="576"/>
+        <w:spacing w:before="20" w:after="80" w:line="324" w:lineRule="auto"/>
+        <w:ind w:left="432" w:hanging="432"/>
         <w:jc w:val="both"/>
       </w:pPr>
+      <w:r>
+        <w:rPr>
+          <w:rFonts w:ascii="Times New Roman" w:hAnsi="Times New Roman"/>
+          <w:b/>
+          <w:i w:val="0"/>
+          <w:color w:val="000000"/>
+          <w:sz w:val="24"/>
+        </w:rPr>
+        <w:t>2.</w:t>
+        <w:tab/>
+      </w:r>
       <w:r>
         <w:rPr>
           <w:rFonts w:ascii="Times New Roman" w:hAnsi="Times New Roman"/>
@@ -2217,15 +2602,26 @@
           <w:color w:val="000000"/>
           <w:sz w:val="24"/>
         </w:rPr>
-        <w:t>2. Dark Mode Toggle: A one-click toggle in the header switches dynamically between Light and Dark dungeon themes.</w:t>
+        <w:t>Dark Mode Toggle: A one-click toggle in the header switches dynamically between Light and Dark dungeon themes.</w:t>
       </w:r>
     </w:p>
     <w:p>
       <w:pPr>
-        <w:spacing w:before="0" w:after="120" w:line="360" w:lineRule="auto"/>
-        <w:ind w:firstLine="576"/>
+        <w:spacing w:before="20" w:after="80" w:line="324" w:lineRule="auto"/>
+        <w:ind w:left="432" w:hanging="432"/>
         <w:jc w:val="both"/>
       </w:pPr>
+      <w:r>
+        <w:rPr>
+          <w:rFonts w:ascii="Times New Roman" w:hAnsi="Times New Roman"/>
+          <w:b/>
+          <w:i w:val="0"/>
+          <w:color w:val="000000"/>
+          <w:sz w:val="24"/>
+        </w:rPr>
+        <w:t>3.</w:t>
+        <w:tab/>
+      </w:r>
       <w:r>
         <w:rPr>
           <w:rFonts w:ascii="Times New Roman" w:hAnsi="Times New Roman"/>
@@ -2234,15 +2630,26 @@
           <w:color w:val="000000"/>
           <w:sz w:val="24"/>
         </w:rPr>
-        <w:t>3. Hero Stats &amp; Inventory Sheet: A collapsible RPG HUD displaying character level (Level 10 Master), HP/Mana gauges, and clickable artifacts (Sacred Lore Scroll, Groq AI Core, Python Blade).</w:t>
+        <w:t>Hero Stats &amp; Inventory Sheet: A collapsible RPG HUD displaying character level (Level 10 Master), HP/Mana gauges, and clickable artifacts (Sacred Lore Scroll, Groq AI Core, Python Blade).</w:t>
       </w:r>
     </w:p>
     <w:p>
       <w:pPr>
-        <w:spacing w:before="0" w:after="120" w:line="360" w:lineRule="auto"/>
-        <w:ind w:firstLine="576"/>
+        <w:spacing w:before="20" w:after="80" w:line="324" w:lineRule="auto"/>
+        <w:ind w:left="432" w:hanging="432"/>
         <w:jc w:val="both"/>
       </w:pPr>
+      <w:r>
+        <w:rPr>
+          <w:rFonts w:ascii="Times New Roman" w:hAnsi="Times New Roman"/>
+          <w:b/>
+          <w:i w:val="0"/>
+          <w:color w:val="000000"/>
+          <w:sz w:val="24"/>
+        </w:rPr>
+        <w:t>4.</w:t>
+        <w:tab/>
+      </w:r>
       <w:r>
         <w:rPr>
           <w:rFonts w:ascii="Times New Roman" w:hAnsi="Times New Roman"/>
@@ -2251,15 +2658,26 @@
           <w:color w:val="000000"/>
           <w:sz w:val="24"/>
         </w:rPr>
-        <w:t>4. Quick Dialogue Options: Fast-tap dialogue pills for immediate narrative queries.</w:t>
+        <w:t>Quick Dialogue Options: Fast-tap dialogue pills for immediate narrative queries.</w:t>
       </w:r>
     </w:p>
     <w:p>
       <w:pPr>
-        <w:spacing w:before="0" w:after="120" w:line="360" w:lineRule="auto"/>
-        <w:ind w:firstLine="576"/>
+        <w:spacing w:before="20" w:after="80" w:line="324" w:lineRule="auto"/>
+        <w:ind w:left="432" w:hanging="432"/>
         <w:jc w:val="both"/>
       </w:pPr>
+      <w:r>
+        <w:rPr>
+          <w:rFonts w:ascii="Times New Roman" w:hAnsi="Times New Roman"/>
+          <w:b/>
+          <w:i w:val="0"/>
+          <w:color w:val="000000"/>
+          <w:sz w:val="24"/>
+        </w:rPr>
+        <w:t>5.</w:t>
+        <w:tab/>
+      </w:r>
       <w:r>
         <w:rPr>
           <w:rFonts w:ascii="Times New Roman" w:hAnsi="Times New Roman"/>
@@ -2268,15 +2686,26 @@
           <w:color w:val="000000"/>
           <w:sz w:val="24"/>
         </w:rPr>
-        <w:t>5. Web Audio API 8-Bit Synthesizer: Generates ascending chirp waveforms on message dispatch and multi-frequency harmonic arpeggios on assistant receipt.</w:t>
+        <w:t>Web Audio API 8-Bit Synthesizer: Generates ascending chirp waveforms on message dispatch and multi-frequency harmonic arpeggios on assistant receipt.</w:t>
       </w:r>
     </w:p>
     <w:p>
       <w:pPr>
-        <w:spacing w:before="0" w:after="120" w:line="360" w:lineRule="auto"/>
-        <w:ind w:firstLine="576"/>
+        <w:spacing w:before="20" w:after="80" w:line="324" w:lineRule="auto"/>
+        <w:ind w:left="432" w:hanging="432"/>
         <w:jc w:val="both"/>
       </w:pPr>
+      <w:r>
+        <w:rPr>
+          <w:rFonts w:ascii="Times New Roman" w:hAnsi="Times New Roman"/>
+          <w:b/>
+          <w:i w:val="0"/>
+          <w:color w:val="000000"/>
+          <w:sz w:val="24"/>
+        </w:rPr>
+        <w:t>6.</w:t>
+        <w:tab/>
+      </w:r>
       <w:r>
         <w:rPr>
           <w:rFonts w:ascii="Times New Roman" w:hAnsi="Times New Roman"/>
@@ -2285,15 +2714,26 @@
           <w:color w:val="000000"/>
           <w:sz w:val="24"/>
         </w:rPr>
-        <w:t>6. Web Speech API (Text-to-Speech): Configures pitch and speech rate to give Eldrin an authentic, resonant wizard voice.</w:t>
+        <w:t>Web Speech API (Text-to-Speech): Configures pitch and speech rate to give Eldrin an authentic, resonant wizard voice.</w:t>
       </w:r>
     </w:p>
     <w:p>
       <w:pPr>
-        <w:spacing w:before="0" w:after="120" w:line="360" w:lineRule="auto"/>
-        <w:ind w:firstLine="576"/>
+        <w:spacing w:before="20" w:after="80" w:line="324" w:lineRule="auto"/>
+        <w:ind w:left="432" w:hanging="432"/>
         <w:jc w:val="both"/>
       </w:pPr>
+      <w:r>
+        <w:rPr>
+          <w:rFonts w:ascii="Times New Roman" w:hAnsi="Times New Roman"/>
+          <w:b/>
+          <w:i w:val="0"/>
+          <w:color w:val="000000"/>
+          <w:sz w:val="24"/>
+        </w:rPr>
+        <w:t>7.</w:t>
+        <w:tab/>
+      </w:r>
       <w:r>
         <w:rPr>
           <w:rFonts w:ascii="Times New Roman" w:hAnsi="Times New Roman"/>
@@ -2302,12 +2742,13 @@
           <w:color w:val="000000"/>
           <w:sz w:val="24"/>
         </w:rPr>
-        <w:t>7. Typewriter Text Streaming: Character-by-character typewriter streaming mimicking retro 16-bit RPG text engines.</w:t>
+        <w:t>Typewriter Text Streaming: Character-by-character typewriter streaming mimicking retro 16-bit RPG text engines.</w:t>
       </w:r>
     </w:p>
     <w:p>
       <w:pPr>
-        <w:spacing w:before="240" w:after="120" w:line="276" w:lineRule="auto"/>
+        <w:keepNext/>
+        <w:spacing w:before="200" w:after="80" w:line="276" w:lineRule="auto"/>
         <w:jc w:val="left"/>
       </w:pPr>
       <w:r>
@@ -2345,7 +2786,8 @@
     </w:p>
     <w:p>
       <w:pPr>
-        <w:spacing w:before="360" w:after="160" w:line="276" w:lineRule="auto"/>
+        <w:keepNext/>
+        <w:spacing w:before="320" w:after="120" w:line="276" w:lineRule="auto"/>
         <w:jc w:val="left"/>
       </w:pPr>
       <w:r>
@@ -2378,7 +2820,8 @@
     </w:p>
     <w:p>
       <w:pPr>
-        <w:spacing w:before="240" w:after="120" w:line="276" w:lineRule="auto"/>
+        <w:keepNext/>
+        <w:spacing w:before="200" w:after="80" w:line="276" w:lineRule="auto"/>
         <w:jc w:val="left"/>
       </w:pPr>
       <w:r>
@@ -2394,10 +2837,21 @@
     </w:p>
     <w:p>
       <w:pPr>
-        <w:spacing w:before="0" w:after="120" w:line="360" w:lineRule="auto"/>
-        <w:ind w:firstLine="576"/>
+        <w:spacing w:before="20" w:after="80" w:line="324" w:lineRule="auto"/>
+        <w:ind w:left="432" w:hanging="432"/>
         <w:jc w:val="both"/>
       </w:pPr>
+      <w:r>
+        <w:rPr>
+          <w:rFonts w:ascii="Times New Roman" w:hAnsi="Times New Roman"/>
+          <w:b/>
+          <w:i w:val="0"/>
+          <w:color w:val="000000"/>
+          <w:sz w:val="24"/>
+        </w:rPr>
+        <w:t>•</w:t>
+        <w:tab/>
+      </w:r>
       <w:r>
         <w:rPr>
           <w:rFonts w:ascii="Times New Roman" w:hAnsi="Times New Roman"/>
@@ -2406,15 +2860,26 @@
           <w:color w:val="000000"/>
           <w:sz w:val="24"/>
         </w:rPr>
-        <w:t>• User Query: "Who created this world and what tools did they use?"</w:t>
+        <w:t>User Query: "Who created this world and what tools did they use?"</w:t>
       </w:r>
     </w:p>
     <w:p>
       <w:pPr>
-        <w:spacing w:before="0" w:after="120" w:line="360" w:lineRule="auto"/>
-        <w:ind w:firstLine="576"/>
+        <w:spacing w:before="20" w:after="80" w:line="324" w:lineRule="auto"/>
+        <w:ind w:left="432" w:hanging="432"/>
         <w:jc w:val="both"/>
       </w:pPr>
+      <w:r>
+        <w:rPr>
+          <w:rFonts w:ascii="Times New Roman" w:hAnsi="Times New Roman"/>
+          <w:b/>
+          <w:i w:val="0"/>
+          <w:color w:val="000000"/>
+          <w:sz w:val="24"/>
+        </w:rPr>
+        <w:t>•</w:t>
+        <w:tab/>
+      </w:r>
       <w:r>
         <w:rPr>
           <w:rFonts w:ascii="Times New Roman" w:hAnsi="Times New Roman"/>
@@ -2423,15 +2888,26 @@
           <w:color w:val="000000"/>
           <w:sz w:val="24"/>
         </w:rPr>
-        <w:t>• Execution Path: The agent identifies the query as lore-specific, invokes the read_lore tool, reads game_lore.txt, and formulates the response.</w:t>
+        <w:t>Execution Path: The agent identifies the query as lore-specific, invokes the read_lore tool, reads game_lore.txt, and formulates the response.</w:t>
       </w:r>
     </w:p>
     <w:p>
       <w:pPr>
-        <w:spacing w:before="0" w:after="120" w:line="360" w:lineRule="auto"/>
-        <w:ind w:firstLine="576"/>
+        <w:spacing w:before="20" w:after="80" w:line="324" w:lineRule="auto"/>
+        <w:ind w:left="432" w:hanging="432"/>
         <w:jc w:val="both"/>
       </w:pPr>
+      <w:r>
+        <w:rPr>
+          <w:rFonts w:ascii="Times New Roman" w:hAnsi="Times New Roman"/>
+          <w:b/>
+          <w:i w:val="0"/>
+          <w:color w:val="000000"/>
+          <w:sz w:val="24"/>
+        </w:rPr>
+        <w:t>•</w:t>
+        <w:tab/>
+      </w:r>
       <w:r>
         <w:rPr>
           <w:rFonts w:ascii="Times New Roman" w:hAnsi="Times New Roman"/>
@@ -2440,30 +2916,62 @@
           <w:color w:val="000000"/>
           <w:sz w:val="24"/>
         </w:rPr>
-        <w:t>• Result: Eldrin praises Prasa as the legendary developer and explicitly cites Python, HTML/CSS/JS, FastAPI, and the Groq AI Core as the tools used.</w:t>
+        <w:t>Result: Eldrin praises Prasa as the legendary developer and explicitly cites Python, HTML/CSS/JS, FastAPI, and the Groq AI Core as the tools used.</w:t>
       </w:r>
     </w:p>
+    <w:tbl>
+      <w:tblPr>
+        <w:tblW w:type="auto" w:w="0"/>
+        <w:jc w:val="center"/>
+        <w:tblLook w:firstColumn="1" w:firstRow="1" w:lastColumn="0" w:lastRow="0" w:noHBand="0" w:noVBand="1" w:val="04A0"/>
+        <w:tblBorders>
+          <w:top w:val="dashed" w:sz="6" w:space="0" w:color="94A3B8"/>
+          <w:bottom w:val="dashed" w:sz="6" w:space="0" w:color="94A3B8"/>
+          <w:left w:val="none"/>
+          <w:right w:val="none"/>
+          <w:insideH w:val="dashed" w:sz="6" w:space="0" w:color="94A3B8"/>
+          <w:insideV w:val="none"/>
+        </w:tblBorders>
+      </w:tblPr>
+      <w:tblGrid>
+        <w:gridCol w:w="8352"/>
+      </w:tblGrid>
+      <w:tr>
+        <w:tc>
+          <w:tcPr>
+            <w:tcW w:type="dxa" w:w="8669"/>
+            <w:shd w:fill="F8FAFC"/>
+            <w:tcMar>
+              <w:top w:w="200" w:type="dxa"/>
+              <w:bottom w:w="200" w:type="dxa"/>
+              <w:left w:w="150" w:type="dxa"/>
+              <w:right w:w="150" w:type="dxa"/>
+            </w:tcMar>
+          </w:tcPr>
+          <w:p>
+            <w:pPr>
+              <w:jc w:val="center"/>
+            </w:pPr>
+            <w:r>
+              <w:rPr>
+                <w:rFonts w:ascii="Times New Roman" w:hAnsi="Times New Roman"/>
+                <w:b w:val="0"/>
+                <w:i/>
+                <w:color w:val="475569"/>
+                <w:sz w:val="20"/>
+              </w:rPr>
+              <w:t>[ SCREENSHOT 1: IN-DOMAIN QUERY OUTPUT ]</w:t>
+              <w:br/>
+              <w:t>(Insert screenshot of browser showing Eldrin praising developer Prasa and citing technical tools)</w:t>
+            </w:r>
+          </w:p>
+        </w:tc>
+      </w:tr>
+    </w:tbl>
     <w:p>
       <w:pPr>
-        <w:spacing w:before="200" w:after="200" w:line="360" w:lineRule="auto"/>
-        <w:jc w:val="center"/>
-      </w:pPr>
-      <w:r>
-        <w:rPr>
-          <w:rFonts w:ascii="Times New Roman" w:hAnsi="Times New Roman"/>
-          <w:b w:val="0"/>
-          <w:i/>
-          <w:color w:val="000000"/>
-          <w:sz w:val="20"/>
-        </w:rPr>
-        <w:t>[ SCREENSHOT 1: IN-DOMAIN QUERY OUTPUT ]</w:t>
-        <w:br/>
-        <w:t>(Attach screenshot of browser showing Eldrin praising developer Prasa and citing technical tools)</w:t>
-      </w:r>
-    </w:p>
-    <w:p>
-      <w:pPr>
-        <w:spacing w:before="240" w:after="120" w:line="276" w:lineRule="auto"/>
+        <w:keepNext/>
+        <w:spacing w:before="200" w:after="80" w:line="276" w:lineRule="auto"/>
         <w:jc w:val="left"/>
       </w:pPr>
       <w:r>
@@ -2479,10 +2987,21 @@
     </w:p>
     <w:p>
       <w:pPr>
-        <w:spacing w:before="0" w:after="120" w:line="360" w:lineRule="auto"/>
-        <w:ind w:firstLine="576"/>
+        <w:spacing w:before="20" w:after="80" w:line="324" w:lineRule="auto"/>
+        <w:ind w:left="432" w:hanging="432"/>
         <w:jc w:val="both"/>
       </w:pPr>
+      <w:r>
+        <w:rPr>
+          <w:rFonts w:ascii="Times New Roman" w:hAnsi="Times New Roman"/>
+          <w:b/>
+          <w:i w:val="0"/>
+          <w:color w:val="000000"/>
+          <w:sz w:val="24"/>
+        </w:rPr>
+        <w:t>•</w:t>
+        <w:tab/>
+      </w:r>
       <w:r>
         <w:rPr>
           <w:rFonts w:ascii="Times New Roman" w:hAnsi="Times New Roman"/>
@@ -2491,15 +3010,26 @@
           <w:color w:val="000000"/>
           <w:sz w:val="24"/>
         </w:rPr>
-        <w:t>• User Query: "What is the square root of 6561 in modern calculus?"</w:t>
+        <w:t>User Query: "What is the square root of 6561 in modern calculus?"</w:t>
       </w:r>
     </w:p>
     <w:p>
       <w:pPr>
-        <w:spacing w:before="0" w:after="120" w:line="360" w:lineRule="auto"/>
-        <w:ind w:firstLine="576"/>
+        <w:spacing w:before="20" w:after="80" w:line="324" w:lineRule="auto"/>
+        <w:ind w:left="432" w:hanging="432"/>
         <w:jc w:val="both"/>
       </w:pPr>
+      <w:r>
+        <w:rPr>
+          <w:rFonts w:ascii="Times New Roman" w:hAnsi="Times New Roman"/>
+          <w:b/>
+          <w:i w:val="0"/>
+          <w:color w:val="000000"/>
+          <w:sz w:val="24"/>
+        </w:rPr>
+        <w:t>•</w:t>
+        <w:tab/>
+      </w:r>
       <w:r>
         <w:rPr>
           <w:rFonts w:ascii="Times New Roman" w:hAnsi="Times New Roman"/>
@@ -2508,15 +3038,26 @@
           <w:color w:val="000000"/>
           <w:sz w:val="24"/>
         </w:rPr>
-        <w:t>• Execution Path: The persona guardrail evaluates the query as modern mathematics external to Aethelgard.</w:t>
+        <w:t>Execution Path: The persona guardrail evaluates the query as modern mathematics external to Aethelgard.</w:t>
       </w:r>
     </w:p>
     <w:p>
       <w:pPr>
-        <w:spacing w:before="0" w:after="120" w:line="360" w:lineRule="auto"/>
-        <w:ind w:firstLine="576"/>
+        <w:spacing w:before="20" w:after="80" w:line="324" w:lineRule="auto"/>
+        <w:ind w:left="432" w:hanging="432"/>
         <w:jc w:val="both"/>
       </w:pPr>
+      <w:r>
+        <w:rPr>
+          <w:rFonts w:ascii="Times New Roman" w:hAnsi="Times New Roman"/>
+          <w:b/>
+          <w:i w:val="0"/>
+          <w:color w:val="000000"/>
+          <w:sz w:val="24"/>
+        </w:rPr>
+        <w:t>•</w:t>
+        <w:tab/>
+      </w:r>
       <w:r>
         <w:rPr>
           <w:rFonts w:ascii="Times New Roman" w:hAnsi="Times New Roman"/>
@@ -2525,27 +3066,58 @@
           <w:color w:val="000000"/>
           <w:sz w:val="24"/>
         </w:rPr>
-        <w:t>• Result: Eldrin politely refuses to perform the computation, stating that he is only the archivist of Aethelgard and possesses no knowledge of modern arithmetic.</w:t>
+        <w:t>Result: Eldrin politely refuses to perform the computation, stating that he is only the archivist of Aethelgard and possesses no knowledge of modern arithmetic.</w:t>
       </w:r>
     </w:p>
-    <w:p>
-      <w:pPr>
-        <w:spacing w:before="200" w:after="200" w:line="360" w:lineRule="auto"/>
+    <w:tbl>
+      <w:tblPr>
+        <w:tblW w:type="auto" w:w="0"/>
         <w:jc w:val="center"/>
-      </w:pPr>
-      <w:r>
-        <w:rPr>
-          <w:rFonts w:ascii="Times New Roman" w:hAnsi="Times New Roman"/>
-          <w:b w:val="0"/>
-          <w:i/>
-          <w:color w:val="000000"/>
-          <w:sz w:val="20"/>
-        </w:rPr>
-        <w:t>[ SCREENSHOT 2: OUT-OF-DOMAIN GUARDRAIL REFUSAL ]</w:t>
-        <w:br/>
-        <w:t>(Attach screenshot of browser showing Eldrin refusing calculus/math questions to maintain character)</w:t>
-      </w:r>
-    </w:p>
+        <w:tblLook w:firstColumn="1" w:firstRow="1" w:lastColumn="0" w:lastRow="0" w:noHBand="0" w:noVBand="1" w:val="04A0"/>
+        <w:tblBorders>
+          <w:top w:val="dashed" w:sz="6" w:space="0" w:color="94A3B8"/>
+          <w:bottom w:val="dashed" w:sz="6" w:space="0" w:color="94A3B8"/>
+          <w:left w:val="none"/>
+          <w:right w:val="none"/>
+          <w:insideH w:val="dashed" w:sz="6" w:space="0" w:color="94A3B8"/>
+          <w:insideV w:val="none"/>
+        </w:tblBorders>
+      </w:tblPr>
+      <w:tblGrid>
+        <w:gridCol w:w="8352"/>
+      </w:tblGrid>
+      <w:tr>
+        <w:tc>
+          <w:tcPr>
+            <w:tcW w:type="dxa" w:w="8669"/>
+            <w:shd w:fill="F8FAFC"/>
+            <w:tcMar>
+              <w:top w:w="200" w:type="dxa"/>
+              <w:bottom w:w="200" w:type="dxa"/>
+              <w:left w:w="150" w:type="dxa"/>
+              <w:right w:w="150" w:type="dxa"/>
+            </w:tcMar>
+          </w:tcPr>
+          <w:p>
+            <w:pPr>
+              <w:jc w:val="center"/>
+            </w:pPr>
+            <w:r>
+              <w:rPr>
+                <w:rFonts w:ascii="Times New Roman" w:hAnsi="Times New Roman"/>
+                <w:b w:val="0"/>
+                <w:i/>
+                <w:color w:val="475569"/>
+                <w:sz w:val="20"/>
+              </w:rPr>
+              <w:t>[ SCREENSHOT 2: OUT-OF-DOMAIN GUARDRAIL REFUSAL ]</w:t>
+              <w:br/>
+              <w:t>(Insert screenshot of browser showing Eldrin refusing calculus/math questions to maintain character)</w:t>
+            </w:r>
+          </w:p>
+        </w:tc>
+      </w:tr>
+    </w:tbl>
     <w:p>
       <w:r>
         <w:br w:type="page"/>
@@ -2553,7 +3125,8 @@
     </w:p>
     <w:p>
       <w:pPr>
-        <w:spacing w:before="240" w:after="120" w:line="276" w:lineRule="auto"/>
+        <w:keepNext/>
+        <w:spacing w:before="200" w:after="80" w:line="276" w:lineRule="auto"/>
         <w:jc w:val="left"/>
       </w:pPr>
       <w:r>
@@ -2569,10 +3142,21 @@
     </w:p>
     <w:p>
       <w:pPr>
-        <w:spacing w:before="0" w:after="120" w:line="360" w:lineRule="auto"/>
-        <w:ind w:firstLine="576"/>
+        <w:spacing w:before="20" w:after="80" w:line="324" w:lineRule="auto"/>
+        <w:ind w:left="432" w:hanging="432"/>
         <w:jc w:val="both"/>
       </w:pPr>
+      <w:r>
+        <w:rPr>
+          <w:rFonts w:ascii="Times New Roman" w:hAnsi="Times New Roman"/>
+          <w:b/>
+          <w:i w:val="0"/>
+          <w:color w:val="000000"/>
+          <w:sz w:val="24"/>
+        </w:rPr>
+        <w:t>•</w:t>
+        <w:tab/>
+      </w:r>
       <w:r>
         <w:rPr>
           <w:rFonts w:ascii="Times New Roman" w:hAnsi="Times New Roman"/>
@@ -2581,15 +3165,26 @@
           <w:color w:val="000000"/>
           <w:sz w:val="24"/>
         </w:rPr>
-        <w:t>• User Action: Clicking on "🔮 Groq AI Core" in the inventory panel.</w:t>
+        <w:t>User Action: Clicking on "🔮 Groq AI Core" in the inventory panel.</w:t>
       </w:r>
     </w:p>
     <w:p>
       <w:pPr>
-        <w:spacing w:before="0" w:after="120" w:line="360" w:lineRule="auto"/>
-        <w:ind w:firstLine="576"/>
+        <w:spacing w:before="20" w:after="80" w:line="324" w:lineRule="auto"/>
+        <w:ind w:left="432" w:hanging="432"/>
         <w:jc w:val="both"/>
       </w:pPr>
+      <w:r>
+        <w:rPr>
+          <w:rFonts w:ascii="Times New Roman" w:hAnsi="Times New Roman"/>
+          <w:b/>
+          <w:i w:val="0"/>
+          <w:color w:val="000000"/>
+          <w:sz w:val="24"/>
+        </w:rPr>
+        <w:t>•</w:t>
+        <w:tab/>
+      </w:r>
       <w:r>
         <w:rPr>
           <w:rFonts w:ascii="Times New Roman" w:hAnsi="Times New Roman"/>
@@ -2598,30 +3193,62 @@
           <w:color w:val="000000"/>
           <w:sz w:val="24"/>
         </w:rPr>
-        <w:t>• Result: The 8-bit send audio tone triggers immediately. Eldrin verbally narrates the power of the Groq inference engine via Speech Synthesis while typewriter text renders onto the screen.</w:t>
+        <w:t>Result: The 8-bit send audio tone triggers immediately. Eldrin verbally narrates the power of the Groq inference engine via Speech Synthesis while typewriter text renders onto the screen.</w:t>
       </w:r>
     </w:p>
+    <w:tbl>
+      <w:tblPr>
+        <w:tblW w:type="auto" w:w="0"/>
+        <w:jc w:val="center"/>
+        <w:tblLook w:firstColumn="1" w:firstRow="1" w:lastColumn="0" w:lastRow="0" w:noHBand="0" w:noVBand="1" w:val="04A0"/>
+        <w:tblBorders>
+          <w:top w:val="dashed" w:sz="6" w:space="0" w:color="94A3B8"/>
+          <w:bottom w:val="dashed" w:sz="6" w:space="0" w:color="94A3B8"/>
+          <w:left w:val="none"/>
+          <w:right w:val="none"/>
+          <w:insideH w:val="dashed" w:sz="6" w:space="0" w:color="94A3B8"/>
+          <w:insideV w:val="none"/>
+        </w:tblBorders>
+      </w:tblPr>
+      <w:tblGrid>
+        <w:gridCol w:w="8352"/>
+      </w:tblGrid>
+      <w:tr>
+        <w:tc>
+          <w:tcPr>
+            <w:tcW w:type="dxa" w:w="8669"/>
+            <w:shd w:fill="F8FAFC"/>
+            <w:tcMar>
+              <w:top w:w="200" w:type="dxa"/>
+              <w:bottom w:w="200" w:type="dxa"/>
+              <w:left w:w="150" w:type="dxa"/>
+              <w:right w:w="150" w:type="dxa"/>
+            </w:tcMar>
+          </w:tcPr>
+          <w:p>
+            <w:pPr>
+              <w:jc w:val="center"/>
+            </w:pPr>
+            <w:r>
+              <w:rPr>
+                <w:rFonts w:ascii="Times New Roman" w:hAnsi="Times New Roman"/>
+                <w:b w:val="0"/>
+                <w:i/>
+                <w:color w:val="475569"/>
+                <w:sz w:val="20"/>
+              </w:rPr>
+              <w:t>[ SCREENSHOT 3: INVENTORY INTERACTION &amp; LIGHT THEME ]</w:t>
+              <w:br/>
+              <w:t>(Insert screenshot showing the Hero sheet, inventory items, and illuminated light parchment theme)</w:t>
+            </w:r>
+          </w:p>
+        </w:tc>
+      </w:tr>
+    </w:tbl>
     <w:p>
       <w:pPr>
-        <w:spacing w:before="200" w:after="200" w:line="360" w:lineRule="auto"/>
-        <w:jc w:val="center"/>
-      </w:pPr>
-      <w:r>
-        <w:rPr>
-          <w:rFonts w:ascii="Times New Roman" w:hAnsi="Times New Roman"/>
-          <w:b w:val="0"/>
-          <w:i/>
-          <w:color w:val="000000"/>
-          <w:sz w:val="20"/>
-        </w:rPr>
-        <w:t>[ SCREENSHOT 3: INVENTORY INTERACTION &amp; LIGHT THEME ]</w:t>
-        <w:br/>
-        <w:t>(Attach screenshot showing the Hero sheet, inventory items, and illuminated light parchment theme)</w:t>
-      </w:r>
-    </w:p>
-    <w:p>
-      <w:pPr>
-        <w:spacing w:before="240" w:after="120" w:line="276" w:lineRule="auto"/>
+        <w:keepNext/>
+        <w:spacing w:before="200" w:after="80" w:line="276" w:lineRule="auto"/>
         <w:jc w:val="left"/>
       </w:pPr>
       <w:r>
@@ -2637,10 +3264,21 @@
     </w:p>
     <w:p>
       <w:pPr>
-        <w:spacing w:before="0" w:after="120" w:line="360" w:lineRule="auto"/>
-        <w:ind w:firstLine="576"/>
+        <w:spacing w:before="20" w:after="80" w:line="324" w:lineRule="auto"/>
+        <w:ind w:left="432" w:hanging="432"/>
         <w:jc w:val="both"/>
       </w:pPr>
+      <w:r>
+        <w:rPr>
+          <w:rFonts w:ascii="Times New Roman" w:hAnsi="Times New Roman"/>
+          <w:b/>
+          <w:i w:val="0"/>
+          <w:color w:val="000000"/>
+          <w:sz w:val="24"/>
+        </w:rPr>
+        <w:t>•</w:t>
+        <w:tab/>
+      </w:r>
       <w:r>
         <w:rPr>
           <w:rFonts w:ascii="Times New Roman" w:hAnsi="Times New Roman"/>
@@ -2649,15 +3287,26 @@
           <w:color w:val="000000"/>
           <w:sz w:val="24"/>
         </w:rPr>
-        <w:t>• Deployment URL: https://prasadkankhar10.github.io/AIAD/</w:t>
+        <w:t>Deployment URL: https://prasadkankhar10.github.io/AIAD/</w:t>
       </w:r>
     </w:p>
     <w:p>
       <w:pPr>
-        <w:spacing w:before="0" w:after="120" w:line="360" w:lineRule="auto"/>
-        <w:ind w:firstLine="576"/>
+        <w:spacing w:before="20" w:after="80" w:line="324" w:lineRule="auto"/>
+        <w:ind w:left="432" w:hanging="432"/>
         <w:jc w:val="both"/>
       </w:pPr>
+      <w:r>
+        <w:rPr>
+          <w:rFonts w:ascii="Times New Roman" w:hAnsi="Times New Roman"/>
+          <w:b/>
+          <w:i w:val="0"/>
+          <w:color w:val="000000"/>
+          <w:sz w:val="24"/>
+        </w:rPr>
+        <w:t>•</w:t>
+        <w:tab/>
+      </w:r>
       <w:r>
         <w:rPr>
           <w:rFonts w:ascii="Times New Roman" w:hAnsi="Times New Roman"/>
@@ -2666,27 +3315,58 @@
           <w:color w:val="000000"/>
           <w:sz w:val="24"/>
         </w:rPr>
-        <w:t>• Result: The application runs with zero installation overhead across both desktop and mobile browsers, supporting full voice and sound synthesis.</w:t>
+        <w:t>Result: The application runs with zero installation overhead across both desktop and mobile browsers, supporting full voice and sound synthesis.</w:t>
       </w:r>
     </w:p>
-    <w:p>
-      <w:pPr>
-        <w:spacing w:before="200" w:after="200" w:line="360" w:lineRule="auto"/>
+    <w:tbl>
+      <w:tblPr>
+        <w:tblW w:type="auto" w:w="0"/>
         <w:jc w:val="center"/>
-      </w:pPr>
-      <w:r>
-        <w:rPr>
-          <w:rFonts w:ascii="Times New Roman" w:hAnsi="Times New Roman"/>
-          <w:b w:val="0"/>
-          <w:i/>
-          <w:color w:val="000000"/>
-          <w:sz w:val="20"/>
-        </w:rPr>
-        <w:t>[ SCREENSHOT 4: GITHUB PAGES LIVE DEPLOYMENT ]</w:t>
-        <w:br/>
-        <w:t>(Attach screenshot of browser displaying the live GitHub Pages URL with running application)</w:t>
-      </w:r>
-    </w:p>
+        <w:tblLook w:firstColumn="1" w:firstRow="1" w:lastColumn="0" w:lastRow="0" w:noHBand="0" w:noVBand="1" w:val="04A0"/>
+        <w:tblBorders>
+          <w:top w:val="dashed" w:sz="6" w:space="0" w:color="94A3B8"/>
+          <w:bottom w:val="dashed" w:sz="6" w:space="0" w:color="94A3B8"/>
+          <w:left w:val="none"/>
+          <w:right w:val="none"/>
+          <w:insideH w:val="dashed" w:sz="6" w:space="0" w:color="94A3B8"/>
+          <w:insideV w:val="none"/>
+        </w:tblBorders>
+      </w:tblPr>
+      <w:tblGrid>
+        <w:gridCol w:w="8352"/>
+      </w:tblGrid>
+      <w:tr>
+        <w:tc>
+          <w:tcPr>
+            <w:tcW w:type="dxa" w:w="8669"/>
+            <w:shd w:fill="F8FAFC"/>
+            <w:tcMar>
+              <w:top w:w="200" w:type="dxa"/>
+              <w:bottom w:w="200" w:type="dxa"/>
+              <w:left w:w="150" w:type="dxa"/>
+              <w:right w:w="150" w:type="dxa"/>
+            </w:tcMar>
+          </w:tcPr>
+          <w:p>
+            <w:pPr>
+              <w:jc w:val="center"/>
+            </w:pPr>
+            <w:r>
+              <w:rPr>
+                <w:rFonts w:ascii="Times New Roman" w:hAnsi="Times New Roman"/>
+                <w:b w:val="0"/>
+                <w:i/>
+                <w:color w:val="475569"/>
+                <w:sz w:val="20"/>
+              </w:rPr>
+              <w:t>[ SCREENSHOT 4: GITHUB PAGES LIVE DEPLOYMENT ]</w:t>
+              <w:br/>
+              <w:t>(Insert screenshot of browser displaying the live GitHub Pages URL with running application)</w:t>
+            </w:r>
+          </w:p>
+        </w:tc>
+      </w:tr>
+    </w:tbl>
     <w:p>
       <w:r>
         <w:br w:type="page"/>
@@ -2694,7 +3374,8 @@
     </w:p>
     <w:p>
       <w:pPr>
-        <w:spacing w:before="360" w:after="160" w:line="276" w:lineRule="auto"/>
+        <w:keepNext/>
+        <w:spacing w:before="320" w:after="120" w:line="276" w:lineRule="auto"/>
         <w:jc w:val="left"/>
       </w:pPr>
       <w:r>
@@ -2710,7 +3391,8 @@
     </w:p>
     <w:p>
       <w:pPr>
-        <w:spacing w:before="240" w:after="120" w:line="276" w:lineRule="auto"/>
+        <w:keepNext/>
+        <w:spacing w:before="200" w:after="80" w:line="276" w:lineRule="auto"/>
         <w:jc w:val="left"/>
       </w:pPr>
       <w:r>
@@ -2743,10 +3425,21 @@
     </w:p>
     <w:p>
       <w:pPr>
-        <w:spacing w:before="0" w:after="120" w:line="360" w:lineRule="auto"/>
-        <w:ind w:firstLine="576"/>
+        <w:spacing w:before="20" w:after="80" w:line="324" w:lineRule="auto"/>
+        <w:ind w:left="432" w:hanging="432"/>
         <w:jc w:val="both"/>
       </w:pPr>
+      <w:r>
+        <w:rPr>
+          <w:rFonts w:ascii="Times New Roman" w:hAnsi="Times New Roman"/>
+          <w:b/>
+          <w:i w:val="0"/>
+          <w:color w:val="000000"/>
+          <w:sz w:val="24"/>
+        </w:rPr>
+        <w:t>•</w:t>
+        <w:tab/>
+      </w:r>
       <w:r>
         <w:rPr>
           <w:rFonts w:ascii="Times New Roman" w:hAnsi="Times New Roman"/>
@@ -2755,15 +3448,26 @@
           <w:color w:val="000000"/>
           <w:sz w:val="24"/>
         </w:rPr>
-        <w:t>• Strict System Prompt Persona Engineering to eliminate out-of-domain prompt leakage,</w:t>
+        <w:t>Strict System Prompt Persona Engineering to eliminate out-of-domain prompt leakage,</w:t>
       </w:r>
     </w:p>
     <w:p>
       <w:pPr>
-        <w:spacing w:before="0" w:after="120" w:line="360" w:lineRule="auto"/>
-        <w:ind w:firstLine="576"/>
+        <w:spacing w:before="20" w:after="80" w:line="324" w:lineRule="auto"/>
+        <w:ind w:left="432" w:hanging="432"/>
         <w:jc w:val="both"/>
       </w:pPr>
+      <w:r>
+        <w:rPr>
+          <w:rFonts w:ascii="Times New Roman" w:hAnsi="Times New Roman"/>
+          <w:b/>
+          <w:i w:val="0"/>
+          <w:color w:val="000000"/>
+          <w:sz w:val="24"/>
+        </w:rPr>
+        <w:t>•</w:t>
+        <w:tab/>
+      </w:r>
       <w:r>
         <w:rPr>
           <w:rFonts w:ascii="Times New Roman" w:hAnsi="Times New Roman"/>
@@ -2772,15 +3476,26 @@
           <w:color w:val="000000"/>
           <w:sz w:val="24"/>
         </w:rPr>
-        <w:t>• Dynamic Functional Tool Execution (read_lore) to ground answers in factual project specifications,</w:t>
+        <w:t>Dynamic Functional Tool Execution (read_lore) to ground answers in factual project specifications,</w:t>
       </w:r>
     </w:p>
     <w:p>
       <w:pPr>
-        <w:spacing w:before="0" w:after="120" w:line="360" w:lineRule="auto"/>
-        <w:ind w:firstLine="576"/>
+        <w:spacing w:before="20" w:after="80" w:line="324" w:lineRule="auto"/>
+        <w:ind w:left="432" w:hanging="432"/>
         <w:jc w:val="both"/>
       </w:pPr>
+      <w:r>
+        <w:rPr>
+          <w:rFonts w:ascii="Times New Roman" w:hAnsi="Times New Roman"/>
+          <w:b/>
+          <w:i w:val="0"/>
+          <w:color w:val="000000"/>
+          <w:sz w:val="24"/>
+        </w:rPr>
+        <w:t>•</w:t>
+        <w:tab/>
+      </w:r>
       <w:r>
         <w:rPr>
           <w:rFonts w:ascii="Times New Roman" w:hAnsi="Times New Roman"/>
@@ -2789,15 +3504,26 @@
           <w:color w:val="000000"/>
           <w:sz w:val="24"/>
         </w:rPr>
-        <w:t>• Conversational History Memory for multi-turn coherence, and</w:t>
+        <w:t>Conversational History Memory for multi-turn coherence across dialogues, and</w:t>
       </w:r>
     </w:p>
     <w:p>
       <w:pPr>
-        <w:spacing w:before="0" w:after="120" w:line="360" w:lineRule="auto"/>
-        <w:ind w:firstLine="576"/>
+        <w:spacing w:before="20" w:after="80" w:line="324" w:lineRule="auto"/>
+        <w:ind w:left="432" w:hanging="432"/>
         <w:jc w:val="both"/>
       </w:pPr>
+      <w:r>
+        <w:rPr>
+          <w:rFonts w:ascii="Times New Roman" w:hAnsi="Times New Roman"/>
+          <w:b/>
+          <w:i w:val="0"/>
+          <w:color w:val="000000"/>
+          <w:sz w:val="24"/>
+        </w:rPr>
+        <w:t>•</w:t>
+        <w:tab/>
+      </w:r>
       <w:r>
         <w:rPr>
           <w:rFonts w:ascii="Times New Roman" w:hAnsi="Times New Roman"/>
@@ -2806,7 +3532,7 @@
           <w:color w:val="000000"/>
           <w:sz w:val="24"/>
         </w:rPr>
-        <w:t>• Dual-Mode Gamified Web Architecture with audio synthesis and voice narration,</w:t>
+        <w:t>Dual-Mode Gamified Web Architecture with audio synthesis and voice narration,</w:t>
       </w:r>
     </w:p>
     <w:p>
@@ -2828,7 +3554,8 @@
     </w:p>
     <w:p>
       <w:pPr>
-        <w:spacing w:before="240" w:after="120" w:line="276" w:lineRule="auto"/>
+        <w:keepNext/>
+        <w:spacing w:before="200" w:after="80" w:line="276" w:lineRule="auto"/>
         <w:jc w:val="left"/>
       </w:pPr>
       <w:r>
@@ -2861,10 +3588,21 @@
     </w:p>
     <w:p>
       <w:pPr>
-        <w:spacing w:before="0" w:after="120" w:line="360" w:lineRule="auto"/>
-        <w:ind w:firstLine="576"/>
+        <w:spacing w:before="20" w:after="80" w:line="324" w:lineRule="auto"/>
+        <w:ind w:left="432" w:hanging="432"/>
         <w:jc w:val="both"/>
       </w:pPr>
+      <w:r>
+        <w:rPr>
+          <w:rFonts w:ascii="Times New Roman" w:hAnsi="Times New Roman"/>
+          <w:b/>
+          <w:i w:val="0"/>
+          <w:color w:val="000000"/>
+          <w:sz w:val="24"/>
+        </w:rPr>
+        <w:t>1.</w:t>
+        <w:tab/>
+      </w:r>
       <w:r>
         <w:rPr>
           <w:rFonts w:ascii="Times New Roman" w:hAnsi="Times New Roman"/>
@@ -2873,15 +3611,26 @@
           <w:color w:val="000000"/>
           <w:sz w:val="24"/>
         </w:rPr>
-        <w:t>1. Retrieval-Augmented Generation (RAG): Integrating vector embeddings (ChromaDB / FAISS) to index encyclopedic lore across multi-volume game compendiums.</w:t>
+        <w:t>Retrieval-Augmented Generation (RAG): Integrating vector embeddings (ChromaDB / FAISS) to index encyclopedic lore across multi-volume game compendiums.</w:t>
       </w:r>
     </w:p>
     <w:p>
       <w:pPr>
-        <w:spacing w:before="0" w:after="120" w:line="360" w:lineRule="auto"/>
-        <w:ind w:firstLine="576"/>
+        <w:spacing w:before="20" w:after="80" w:line="324" w:lineRule="auto"/>
+        <w:ind w:left="432" w:hanging="432"/>
         <w:jc w:val="both"/>
       </w:pPr>
+      <w:r>
+        <w:rPr>
+          <w:rFonts w:ascii="Times New Roman" w:hAnsi="Times New Roman"/>
+          <w:b/>
+          <w:i w:val="0"/>
+          <w:color w:val="000000"/>
+          <w:sz w:val="24"/>
+        </w:rPr>
+        <w:t>2.</w:t>
+        <w:tab/>
+      </w:r>
       <w:r>
         <w:rPr>
           <w:rFonts w:ascii="Times New Roman" w:hAnsi="Times New Roman"/>
@@ -2890,15 +3639,26 @@
           <w:color w:val="000000"/>
           <w:sz w:val="24"/>
         </w:rPr>
-        <w:t>2. Multi-Agent Ecosystems: Introducing multiple distinct NPCs (merchants, quest givers, companions) that coordinate and trade autonomously using LangGraph.</w:t>
+        <w:t>Multi-Agent Ecosystems: Introducing multiple distinct NPCs (merchants, quest givers, companions) that coordinate and trade autonomously using LangGraph.</w:t>
       </w:r>
     </w:p>
     <w:p>
       <w:pPr>
-        <w:spacing w:before="0" w:after="120" w:line="360" w:lineRule="auto"/>
-        <w:ind w:firstLine="576"/>
+        <w:spacing w:before="20" w:after="80" w:line="324" w:lineRule="auto"/>
+        <w:ind w:left="432" w:hanging="432"/>
         <w:jc w:val="both"/>
       </w:pPr>
+      <w:r>
+        <w:rPr>
+          <w:rFonts w:ascii="Times New Roman" w:hAnsi="Times New Roman"/>
+          <w:b/>
+          <w:i w:val="0"/>
+          <w:color w:val="000000"/>
+          <w:sz w:val="24"/>
+        </w:rPr>
+        <w:t>3.</w:t>
+        <w:tab/>
+      </w:r>
       <w:r>
         <w:rPr>
           <w:rFonts w:ascii="Times New Roman" w:hAnsi="Times New Roman"/>
@@ -2907,15 +3667,26 @@
           <w:color w:val="000000"/>
           <w:sz w:val="24"/>
         </w:rPr>
-        <w:t>3. Player State Cloud Persistence: Linking character progression and inventory state to persistent databases (PostgreSQL or Firebase).</w:t>
+        <w:t>Player State Cloud Persistence: Linking character progression and inventory state to persistent databases (PostgreSQL or Firebase).</w:t>
       </w:r>
     </w:p>
     <w:p>
       <w:pPr>
-        <w:spacing w:before="0" w:after="120" w:line="360" w:lineRule="auto"/>
-        <w:ind w:firstLine="576"/>
+        <w:spacing w:before="20" w:after="80" w:line="324" w:lineRule="auto"/>
+        <w:ind w:left="432" w:hanging="432"/>
         <w:jc w:val="both"/>
       </w:pPr>
+      <w:r>
+        <w:rPr>
+          <w:rFonts w:ascii="Times New Roman" w:hAnsi="Times New Roman"/>
+          <w:b/>
+          <w:i w:val="0"/>
+          <w:color w:val="000000"/>
+          <w:sz w:val="24"/>
+        </w:rPr>
+        <w:t>4.</w:t>
+        <w:tab/>
+      </w:r>
       <w:r>
         <w:rPr>
           <w:rFonts w:ascii="Times New Roman" w:hAnsi="Times New Roman"/>
@@ -2924,7 +3695,7 @@
           <w:color w:val="000000"/>
           <w:sz w:val="24"/>
         </w:rPr>
-        <w:t>4. 3D WebGL / Three.js Visual Avatars: Synchronizing real-time phoneme audio with 3D animated character meshes.</w:t>
+        <w:t>3D WebGL / Three.js Visual Avatars: Synchronizing real-time phoneme audio with 3D animated character meshes.</w:t>
       </w:r>
     </w:p>
     <w:p>
@@ -2934,7 +3705,8 @@
     </w:p>
     <w:p>
       <w:pPr>
-        <w:spacing w:before="360" w:after="160" w:line="276" w:lineRule="auto"/>
+        <w:keepNext/>
+        <w:spacing w:before="320" w:after="120" w:line="276" w:lineRule="auto"/>
         <w:jc w:val="left"/>
       </w:pPr>
       <w:r>
@@ -2950,7 +3722,7 @@
     </w:p>
     <w:p>
       <w:pPr>
-        <w:spacing w:before="0" w:after="160" w:line="360" w:lineRule="auto"/>
+        <w:spacing w:before="40" w:after="120" w:line="324" w:lineRule="auto"/>
         <w:jc w:val="both"/>
       </w:pPr>
       <w:r>
@@ -2961,12 +3733,12 @@
           <w:color w:val="000000"/>
           <w:sz w:val="22"/>
         </w:rPr>
-        <w:t>[1] Vaswani, A., et al. (2017). "Attention Is All You Need." Advances in Neural Information Processing Systems (NeurIPS), 30.</w:t>
+        <w:t>[1]  Vaswani, A., et al. (2017). "Attention Is All You Need." Advances in Neural Information Processing Systems (NeurIPS), 30.</w:t>
       </w:r>
     </w:p>
     <w:p>
       <w:pPr>
-        <w:spacing w:before="0" w:after="160" w:line="360" w:lineRule="auto"/>
+        <w:spacing w:before="40" w:after="120" w:line="324" w:lineRule="auto"/>
         <w:jc w:val="both"/>
       </w:pPr>
       <w:r>
@@ -2977,12 +3749,12 @@
           <w:color w:val="000000"/>
           <w:sz w:val="22"/>
         </w:rPr>
-        <w:t>[2] Schick, T., et al. (2023). "Toolformer: Language Models Can Teach Themselves to Use Tools." arXiv preprint arXiv:2302.04761.</w:t>
+        <w:t>[2]  Schick, T., et al. (2023). "Toolformer: Language Models Can Teach Themselves to Use Tools." arXiv preprint arXiv:2302.04761.</w:t>
       </w:r>
     </w:p>
     <w:p>
       <w:pPr>
-        <w:spacing w:before="0" w:after="160" w:line="360" w:lineRule="auto"/>
+        <w:spacing w:before="40" w:after="120" w:line="324" w:lineRule="auto"/>
         <w:jc w:val="both"/>
       </w:pPr>
       <w:r>
@@ -2993,12 +3765,12 @@
           <w:color w:val="000000"/>
           <w:sz w:val="22"/>
         </w:rPr>
-        <w:t>[3] OpenAI API Documentation. (2024). "Function Calling and Structured Outputs." Available: https://platform.openai.com/docs/guides/function-calling</w:t>
+        <w:t>[3]  OpenAI API Documentation. (2024). "Function Calling and Structured Outputs." Available: https://platform.openai.com/docs/guides/function-calling</w:t>
       </w:r>
     </w:p>
     <w:p>
       <w:pPr>
-        <w:spacing w:before="0" w:after="160" w:line="360" w:lineRule="auto"/>
+        <w:spacing w:before="40" w:after="120" w:line="324" w:lineRule="auto"/>
         <w:jc w:val="both"/>
       </w:pPr>
       <w:r>
@@ -3009,12 +3781,12 @@
           <w:color w:val="000000"/>
           <w:sz w:val="22"/>
         </w:rPr>
-        <w:t>[4] Groq Cloud Documentation. (2024). "Fast LLM Inference on Language Processing Units (LPUs)." Available: https://console.groq.com/docs</w:t>
+        <w:t>[4]  Groq Cloud Documentation. (2024). "Fast LLM Inference on Language Processing Units (LPUs)." Available: https://console.groq.com/docs</w:t>
       </w:r>
     </w:p>
     <w:p>
       <w:pPr>
-        <w:spacing w:before="0" w:after="160" w:line="360" w:lineRule="auto"/>
+        <w:spacing w:before="40" w:after="120" w:line="324" w:lineRule="auto"/>
         <w:jc w:val="both"/>
       </w:pPr>
       <w:r>
@@ -3025,12 +3797,12 @@
           <w:color w:val="000000"/>
           <w:sz w:val="22"/>
         </w:rPr>
-        <w:t>[5] Ramírez, E. (2023). "FastAPI: High Performance Modern Python Web Framework." Available: https://fastapi.tiangolo.com</w:t>
+        <w:t>[5]  Ramírez, E. (2023). "FastAPI: High Performance Modern Python Web Framework." Available: https://fastapi.tiangolo.com</w:t>
       </w:r>
     </w:p>
     <w:p>
       <w:pPr>
-        <w:spacing w:before="0" w:after="160" w:line="360" w:lineRule="auto"/>
+        <w:spacing w:before="40" w:after="120" w:line="324" w:lineRule="auto"/>
         <w:jc w:val="both"/>
       </w:pPr>
       <w:r>
@@ -3041,12 +3813,12 @@
           <w:color w:val="000000"/>
           <w:sz w:val="22"/>
         </w:rPr>
-        <w:t>[6] W3C Web Audio Working Group. (2021). "Web Audio API Specification." Available: https://www.w3.org/TR/webaudio/</w:t>
+        <w:t>[6]  W3C Web Audio Working Group. (2021). "Web Audio API Specification." Available: https://www.w3.org/TR/webaudio/</w:t>
       </w:r>
     </w:p>
     <w:p>
       <w:pPr>
-        <w:spacing w:before="0" w:after="160" w:line="360" w:lineRule="auto"/>
+        <w:spacing w:before="40" w:after="120" w:line="324" w:lineRule="auto"/>
         <w:jc w:val="both"/>
       </w:pPr>
       <w:r>
@@ -3057,12 +3829,12 @@
           <w:color w:val="000000"/>
           <w:sz w:val="22"/>
         </w:rPr>
-        <w:t>[7] W3C Speech API Community Group. (2020). "Web Speech API Specification." Available: https://wicg.github.io/speech-api/</w:t>
+        <w:t>[7]  W3C Speech API Community Group. (2020). "Web Speech API Specification." Available: https://wicg.github.io/speech-api/</w:t>
       </w:r>
     </w:p>
     <w:p>
       <w:pPr>
-        <w:spacing w:before="0" w:after="160" w:line="360" w:lineRule="auto"/>
+        <w:spacing w:before="40" w:after="120" w:line="324" w:lineRule="auto"/>
         <w:jc w:val="both"/>
       </w:pPr>
       <w:r>
@@ -3073,7 +3845,7 @@
           <w:color w:val="000000"/>
           <w:sz w:val="22"/>
         </w:rPr>
-        <w:t>[8] Prasad Kankhar. (2026). "AIAD - Chronicles of Prasa Repository &amp; Live Deployment." GitHub: https://github.com/prasadkankhar10/AIAD</w:t>
+        <w:t>[8]  Prasad Kankhar. (2026). "AIAD - Chronicles of Prasa Repository &amp; Live Deployment." GitHub: https://github.com/prasadkankhar10/AIAD</w:t>
       </w:r>
     </w:p>
     <w:sectPr>
@@ -3092,6 +3864,7 @@
   <w:p>
     <w:pPr>
       <w:pStyle w:val="Footer"/>
+      <w:spacing w:before="0" w:after="0"/>
       <w:jc w:val="center"/>
     </w:pPr>
     <w:r>

</xml_diff>

<commit_message>
Remove Literature Review and its references from project report
</commit_message>
<xml_diff>
--- a/Mini_Project_Report_AIAD.docx
+++ b/Mini_Project_Report_AIAD.docx
@@ -572,7 +572,7 @@
                 <w:color w:val="000000"/>
                 <w:sz w:val="22"/>
               </w:rPr>
-              <w:t>Chapter 2: Literature Review &amp; Technology Stack</w:t>
+              <w:t>Chapter 2: Technology Stack &amp; System Requirements</w:t>
             </w:r>
           </w:p>
         </w:tc>
@@ -1226,7 +1226,7 @@
           <w:color w:val="000000"/>
           <w:sz w:val="28"/>
         </w:rPr>
-        <w:t>CHAPTER 2: LITERATURE REVIEW &amp; TECHNOLOGY STACK</w:t>
+        <w:t>CHAPTER 2: TECHNOLOGY STACK &amp; SYSTEM REQUIREMENTS</w:t>
       </w:r>
     </w:p>
     <w:p>
@@ -1243,7 +1243,7 @@
           <w:color w:val="000000"/>
           <w:sz w:val="24"/>
         </w:rPr>
-        <w:t>2.1 Evolution of Conversational Agents</w:t>
+        <w:t>2.1 Technology Stack Architecture</w:t>
       </w:r>
     </w:p>
     <w:p>
@@ -1260,7 +1260,7 @@
           <w:color w:val="000000"/>
           <w:sz w:val="24"/>
         </w:rPr>
-        <w:t>The architectural progression of AI conversational systems can be categorized into three distinct generations:</w:t>
+        <w:t>The Chronicles of Prasa conversational agent is engineered using a decoupled, lightweight technology stack designed specifically for sub-second dialogue response, zero-dependency audio synthesis, and strict persona containment:</w:t>
       </w:r>
     </w:p>
     <w:p>
@@ -1277,7 +1277,7 @@
           <w:color w:val="000000"/>
           <w:sz w:val="24"/>
         </w:rPr>
-        <w:t>1.</w:t>
+        <w:t>•</w:t>
         <w:tab/>
       </w:r>
       <w:r>
@@ -1288,7 +1288,7 @@
           <w:color w:val="000000"/>
           <w:sz w:val="24"/>
         </w:rPr>
-        <w:t>Rule-Based Systems: Relying on regular expressions and keyword lookup tables (as developed in Practical 3). While deterministic, they cannot generalize beyond predefined strings.</w:t>
+        <w:t>Inference Layer (Groq Cloud LPU): Deploys Language Processing Units (LPUs) optimized for matrix multiplications, achieving rapid generation latency essential for realistic gaming dialogues.</w:t>
       </w:r>
     </w:p>
     <w:p>
@@ -1305,7 +1305,7 @@
           <w:color w:val="000000"/>
           <w:sz w:val="24"/>
         </w:rPr>
-        <w:t>2.</w:t>
+        <w:t>•</w:t>
         <w:tab/>
       </w:r>
       <w:r>
@@ -1316,7 +1316,7 @@
           <w:color w:val="000000"/>
           <w:sz w:val="24"/>
         </w:rPr>
-        <w:t>Zero-Shot Prompt-Driven Agents: Employing base LLMs with structured prompts (Practical 4). These handle freeform input but lack live context or external information.</w:t>
+        <w:t>Backend Engine (FastAPI &amp; Uvicorn): Handles asynchronous REST requests, orchestrating multi-turn memory buffers and functional tool execution (read_lore).</w:t>
       </w:r>
     </w:p>
     <w:p>
@@ -1333,7 +1333,7 @@
           <w:color w:val="000000"/>
           <w:sz w:val="24"/>
         </w:rPr>
-        <w:t>3.</w:t>
+        <w:t>•</w:t>
         <w:tab/>
       </w:r>
       <w:r>
@@ -1344,7 +1344,35 @@
           <w:color w:val="000000"/>
           <w:sz w:val="24"/>
         </w:rPr>
-        <w:t>Tool-Augmented Autonomous Agents: Incorporating function calling (Practical 6) and conversational state memory (Practical 5). The agent can assess user queries, decide whether external files or functions must be executed, and synthesize grounded answers.</w:t>
+        <w:t>Audio Feedback Engines (Web Audio &amp; Speech API): Employs native browser APIs to synthesize 8-bit sound effects and spoken wizard voice output without downloading external audio files.</w:t>
+      </w:r>
+    </w:p>
+    <w:p>
+      <w:pPr>
+        <w:spacing w:before="20" w:after="80" w:line="324" w:lineRule="auto"/>
+        <w:ind w:left="432" w:hanging="432"/>
+        <w:jc w:val="both"/>
+      </w:pPr>
+      <w:r>
+        <w:rPr>
+          <w:rFonts w:ascii="Times New Roman" w:hAnsi="Times New Roman"/>
+          <w:b/>
+          <w:i w:val="0"/>
+          <w:color w:val="000000"/>
+          <w:sz w:val="24"/>
+        </w:rPr>
+        <w:t>•</w:t>
+        <w:tab/>
+      </w:r>
+      <w:r>
+        <w:rPr>
+          <w:rFonts w:ascii="Times New Roman" w:hAnsi="Times New Roman"/>
+          <w:b w:val="0"/>
+          <w:i w:val="0"/>
+          <w:color w:val="000000"/>
+          <w:sz w:val="24"/>
+        </w:rPr>
+        <w:t>Dual Deployment Pipeline (Docker &amp; GitHub Pages): Offers containerized portability via Docker alongside zero-install serverless execution via GitHub Pages.</w:t>
       </w:r>
     </w:p>
     <w:p>
@@ -1361,7 +1389,7 @@
           <w:color w:val="000000"/>
           <w:sz w:val="24"/>
         </w:rPr>
-        <w:t>2.2 Hardware and Software Stack</w:t>
+        <w:t>2.2 Hardware and Software Specifications</w:t>
       </w:r>
     </w:p>
     <w:p>
@@ -1378,7 +1406,7 @@
           <w:color w:val="000000"/>
           <w:sz w:val="24"/>
         </w:rPr>
-        <w:t>The project integrates modern web technologies and high-throughput language inference hardware:</w:t>
+        <w:t>The comprehensive technical and environment specifications are detailed below:</w:t>
       </w:r>
     </w:p>
     <w:tbl>
@@ -3733,7 +3761,7 @@
           <w:color w:val="000000"/>
           <w:sz w:val="22"/>
         </w:rPr>
-        <w:t>[1]  Vaswani, A., et al. (2017). "Attention Is All You Need." Advances in Neural Information Processing Systems (NeurIPS), 30.</w:t>
+        <w:t>[1]  OpenAI API Documentation. (2024). "Function Calling and Structured Outputs." Available: https://platform.openai.com/docs/guides/function-calling</w:t>
       </w:r>
     </w:p>
     <w:p>
@@ -3749,7 +3777,7 @@
           <w:color w:val="000000"/>
           <w:sz w:val="22"/>
         </w:rPr>
-        <w:t>[2]  Schick, T., et al. (2023). "Toolformer: Language Models Can Teach Themselves to Use Tools." arXiv preprint arXiv:2302.04761.</w:t>
+        <w:t>[2]  Groq Cloud Documentation. (2024). "Fast LLM Inference on Language Processing Units (LPUs)." Available: https://console.groq.com/docs</w:t>
       </w:r>
     </w:p>
     <w:p>
@@ -3765,7 +3793,7 @@
           <w:color w:val="000000"/>
           <w:sz w:val="22"/>
         </w:rPr>
-        <w:t>[3]  OpenAI API Documentation. (2024). "Function Calling and Structured Outputs." Available: https://platform.openai.com/docs/guides/function-calling</w:t>
+        <w:t>[3]  Ramírez, E. (2023). "FastAPI: High Performance Modern Python Web Framework." Available: https://fastapi.tiangolo.com</w:t>
       </w:r>
     </w:p>
     <w:p>
@@ -3781,7 +3809,7 @@
           <w:color w:val="000000"/>
           <w:sz w:val="22"/>
         </w:rPr>
-        <w:t>[4]  Groq Cloud Documentation. (2024). "Fast LLM Inference on Language Processing Units (LPUs)." Available: https://console.groq.com/docs</w:t>
+        <w:t>[4]  W3C Web Audio Working Group. (2021). "Web Audio API Specification." Available: https://www.w3.org/TR/webaudio/</w:t>
       </w:r>
     </w:p>
     <w:p>
@@ -3797,7 +3825,7 @@
           <w:color w:val="000000"/>
           <w:sz w:val="22"/>
         </w:rPr>
-        <w:t>[5]  Ramírez, E. (2023). "FastAPI: High Performance Modern Python Web Framework." Available: https://fastapi.tiangolo.com</w:t>
+        <w:t>[5]  W3C Speech API Community Group. (2020). "Web Speech API Specification." Available: https://wicg.github.io/speech-api/</w:t>
       </w:r>
     </w:p>
     <w:p>
@@ -3813,7 +3841,7 @@
           <w:color w:val="000000"/>
           <w:sz w:val="22"/>
         </w:rPr>
-        <w:t>[6]  W3C Web Audio Working Group. (2021). "Web Audio API Specification." Available: https://www.w3.org/TR/webaudio/</w:t>
+        <w:t>[6]  Docker Documentation. (2024). "Containerization Reference &amp; Best Practices." Available: https://docs.docker.com</w:t>
       </w:r>
     </w:p>
     <w:p>
@@ -3829,7 +3857,7 @@
           <w:color w:val="000000"/>
           <w:sz w:val="22"/>
         </w:rPr>
-        <w:t>[7]  W3C Speech API Community Group. (2020). "Web Speech API Specification." Available: https://wicg.github.io/speech-api/</w:t>
+        <w:t>[7]  GitHub Pages Documentation. (2024). "Publishing Static Websites from Repositories." Available: https://docs.github.com/pages</w:t>
       </w:r>
     </w:p>
     <w:p>

</xml_diff>

<commit_message>
Remove Literature Review and related references across all report formats
</commit_message>
<xml_diff>
--- a/Mini_Project_Report_AIAD.docx
+++ b/Mini_Project_Report_AIAD.docx
@@ -572,7 +572,7 @@
                 <w:color w:val="000000"/>
                 <w:sz w:val="22"/>
               </w:rPr>
-              <w:t>Chapter 2: Technology Stack &amp; System Requirements</w:t>
+              <w:t>Chapter 2: Technology Stack &amp; System Specifications</w:t>
             </w:r>
           </w:p>
         </w:tc>
@@ -1226,7 +1226,7 @@
           <w:color w:val="000000"/>
           <w:sz w:val="28"/>
         </w:rPr>
-        <w:t>CHAPTER 2: TECHNOLOGY STACK &amp; SYSTEM REQUIREMENTS</w:t>
+        <w:t>CHAPTER 2: TECHNOLOGY STACK &amp; SYSTEM SPECIFICATIONS</w:t>
       </w:r>
     </w:p>
     <w:p>
@@ -1243,7 +1243,7 @@
           <w:color w:val="000000"/>
           <w:sz w:val="24"/>
         </w:rPr>
-        <w:t>2.1 Technology Stack Architecture</w:t>
+        <w:t>2.1 Hardware and Software Environment Specifications</w:t>
       </w:r>
     </w:p>
     <w:p>
@@ -1260,153 +1260,7 @@
           <w:color w:val="000000"/>
           <w:sz w:val="24"/>
         </w:rPr>
-        <w:t>The Chronicles of Prasa conversational agent is engineered using a decoupled, lightweight technology stack designed specifically for sub-second dialogue response, zero-dependency audio synthesis, and strict persona containment:</w:t>
-      </w:r>
-    </w:p>
-    <w:p>
-      <w:pPr>
-        <w:spacing w:before="20" w:after="80" w:line="324" w:lineRule="auto"/>
-        <w:ind w:left="432" w:hanging="432"/>
-        <w:jc w:val="both"/>
-      </w:pPr>
-      <w:r>
-        <w:rPr>
-          <w:rFonts w:ascii="Times New Roman" w:hAnsi="Times New Roman"/>
-          <w:b/>
-          <w:i w:val="0"/>
-          <w:color w:val="000000"/>
-          <w:sz w:val="24"/>
-        </w:rPr>
-        <w:t>•</w:t>
-        <w:tab/>
-      </w:r>
-      <w:r>
-        <w:rPr>
-          <w:rFonts w:ascii="Times New Roman" w:hAnsi="Times New Roman"/>
-          <w:b w:val="0"/>
-          <w:i w:val="0"/>
-          <w:color w:val="000000"/>
-          <w:sz w:val="24"/>
-        </w:rPr>
-        <w:t>Inference Layer (Groq Cloud LPU): Deploys Language Processing Units (LPUs) optimized for matrix multiplications, achieving rapid generation latency essential for realistic gaming dialogues.</w:t>
-      </w:r>
-    </w:p>
-    <w:p>
-      <w:pPr>
-        <w:spacing w:before="20" w:after="80" w:line="324" w:lineRule="auto"/>
-        <w:ind w:left="432" w:hanging="432"/>
-        <w:jc w:val="both"/>
-      </w:pPr>
-      <w:r>
-        <w:rPr>
-          <w:rFonts w:ascii="Times New Roman" w:hAnsi="Times New Roman"/>
-          <w:b/>
-          <w:i w:val="0"/>
-          <w:color w:val="000000"/>
-          <w:sz w:val="24"/>
-        </w:rPr>
-        <w:t>•</w:t>
-        <w:tab/>
-      </w:r>
-      <w:r>
-        <w:rPr>
-          <w:rFonts w:ascii="Times New Roman" w:hAnsi="Times New Roman"/>
-          <w:b w:val="0"/>
-          <w:i w:val="0"/>
-          <w:color w:val="000000"/>
-          <w:sz w:val="24"/>
-        </w:rPr>
-        <w:t>Backend Engine (FastAPI &amp; Uvicorn): Handles asynchronous REST requests, orchestrating multi-turn memory buffers and functional tool execution (read_lore).</w:t>
-      </w:r>
-    </w:p>
-    <w:p>
-      <w:pPr>
-        <w:spacing w:before="20" w:after="80" w:line="324" w:lineRule="auto"/>
-        <w:ind w:left="432" w:hanging="432"/>
-        <w:jc w:val="both"/>
-      </w:pPr>
-      <w:r>
-        <w:rPr>
-          <w:rFonts w:ascii="Times New Roman" w:hAnsi="Times New Roman"/>
-          <w:b/>
-          <w:i w:val="0"/>
-          <w:color w:val="000000"/>
-          <w:sz w:val="24"/>
-        </w:rPr>
-        <w:t>•</w:t>
-        <w:tab/>
-      </w:r>
-      <w:r>
-        <w:rPr>
-          <w:rFonts w:ascii="Times New Roman" w:hAnsi="Times New Roman"/>
-          <w:b w:val="0"/>
-          <w:i w:val="0"/>
-          <w:color w:val="000000"/>
-          <w:sz w:val="24"/>
-        </w:rPr>
-        <w:t>Audio Feedback Engines (Web Audio &amp; Speech API): Employs native browser APIs to synthesize 8-bit sound effects and spoken wizard voice output without downloading external audio files.</w:t>
-      </w:r>
-    </w:p>
-    <w:p>
-      <w:pPr>
-        <w:spacing w:before="20" w:after="80" w:line="324" w:lineRule="auto"/>
-        <w:ind w:left="432" w:hanging="432"/>
-        <w:jc w:val="both"/>
-      </w:pPr>
-      <w:r>
-        <w:rPr>
-          <w:rFonts w:ascii="Times New Roman" w:hAnsi="Times New Roman"/>
-          <w:b/>
-          <w:i w:val="0"/>
-          <w:color w:val="000000"/>
-          <w:sz w:val="24"/>
-        </w:rPr>
-        <w:t>•</w:t>
-        <w:tab/>
-      </w:r>
-      <w:r>
-        <w:rPr>
-          <w:rFonts w:ascii="Times New Roman" w:hAnsi="Times New Roman"/>
-          <w:b w:val="0"/>
-          <w:i w:val="0"/>
-          <w:color w:val="000000"/>
-          <w:sz w:val="24"/>
-        </w:rPr>
-        <w:t>Dual Deployment Pipeline (Docker &amp; GitHub Pages): Offers containerized portability via Docker alongside zero-install serverless execution via GitHub Pages.</w:t>
-      </w:r>
-    </w:p>
-    <w:p>
-      <w:pPr>
-        <w:keepNext/>
-        <w:spacing w:before="200" w:after="80" w:line="276" w:lineRule="auto"/>
-        <w:jc w:val="left"/>
-      </w:pPr>
-      <w:r>
-        <w:rPr>
-          <w:rFonts w:ascii="Times New Roman" w:hAnsi="Times New Roman"/>
-          <w:b/>
-          <w:i w:val="0"/>
-          <w:color w:val="000000"/>
-          <w:sz w:val="24"/>
-        </w:rPr>
-        <w:t>2.2 Hardware and Software Specifications</w:t>
-      </w:r>
-    </w:p>
-    <w:p>
-      <w:pPr>
-        <w:spacing w:before="0" w:after="120" w:line="360" w:lineRule="auto"/>
-        <w:ind w:firstLine="576"/>
-        <w:jc w:val="both"/>
-      </w:pPr>
-      <w:r>
-        <w:rPr>
-          <w:rFonts w:ascii="Times New Roman" w:hAnsi="Times New Roman"/>
-          <w:b w:val="0"/>
-          <w:i w:val="0"/>
-          <w:color w:val="000000"/>
-          <w:sz w:val="24"/>
-        </w:rPr>
-        <w:t>The comprehensive technical and environment specifications are detailed below:</w:t>
+        <w:t>The project integrates modern web technologies, modular backend micro-frameworks, and high-throughput language inference hardware to achieve sub-second conversational latency and deterministic persona confinement:</w:t>
       </w:r>
     </w:p>
     <w:tbl>
@@ -2065,6 +1919,124 @@
         </w:tc>
       </w:tr>
     </w:tbl>
+    <w:p>
+      <w:pPr>
+        <w:keepNext/>
+        <w:spacing w:before="200" w:after="80" w:line="276" w:lineRule="auto"/>
+        <w:jc w:val="left"/>
+      </w:pPr>
+      <w:r>
+        <w:rPr>
+          <w:rFonts w:ascii="Times New Roman" w:hAnsi="Times New Roman"/>
+          <w:b/>
+          <w:i w:val="0"/>
+          <w:color w:val="000000"/>
+          <w:sz w:val="24"/>
+        </w:rPr>
+        <w:t>2.2 Architectural Justification &amp; Tool Selection</w:t>
+      </w:r>
+    </w:p>
+    <w:p>
+      <w:pPr>
+        <w:spacing w:before="0" w:after="120" w:line="360" w:lineRule="auto"/>
+        <w:ind w:firstLine="576"/>
+        <w:jc w:val="both"/>
+      </w:pPr>
+      <w:r>
+        <w:rPr>
+          <w:rFonts w:ascii="Times New Roman" w:hAnsi="Times New Roman"/>
+          <w:b w:val="0"/>
+          <w:i w:val="0"/>
+          <w:color w:val="000000"/>
+          <w:sz w:val="24"/>
+        </w:rPr>
+        <w:t>The selection of tools was driven by the strict latency, security, and immersion requirements of real-time interactive game agents:</w:t>
+      </w:r>
+    </w:p>
+    <w:p>
+      <w:pPr>
+        <w:spacing w:before="20" w:after="80" w:line="324" w:lineRule="auto"/>
+        <w:ind w:left="432" w:hanging="432"/>
+        <w:jc w:val="both"/>
+      </w:pPr>
+      <w:r>
+        <w:rPr>
+          <w:rFonts w:ascii="Times New Roman" w:hAnsi="Times New Roman"/>
+          <w:b/>
+          <w:i w:val="0"/>
+          <w:color w:val="000000"/>
+          <w:sz w:val="24"/>
+        </w:rPr>
+        <w:t>•</w:t>
+        <w:tab/>
+      </w:r>
+      <w:r>
+        <w:rPr>
+          <w:rFonts w:ascii="Times New Roman" w:hAnsi="Times New Roman"/>
+          <w:b w:val="0"/>
+          <w:i w:val="0"/>
+          <w:color w:val="000000"/>
+          <w:sz w:val="24"/>
+        </w:rPr>
+        <w:t>Groq LPU Inference: Traditional cloud APIs often introduce 2-4 second response delays, which severely disrupts game dialogue fluidity. Groq's custom LPU architecture delivers token generation speeds exceeding 300 tokens/sec, enabling immediate verbal NPC dialogue.</w:t>
+      </w:r>
+    </w:p>
+    <w:p>
+      <w:pPr>
+        <w:spacing w:before="20" w:after="80" w:line="324" w:lineRule="auto"/>
+        <w:ind w:left="432" w:hanging="432"/>
+        <w:jc w:val="both"/>
+      </w:pPr>
+      <w:r>
+        <w:rPr>
+          <w:rFonts w:ascii="Times New Roman" w:hAnsi="Times New Roman"/>
+          <w:b/>
+          <w:i w:val="0"/>
+          <w:color w:val="000000"/>
+          <w:sz w:val="24"/>
+        </w:rPr>
+        <w:t>•</w:t>
+        <w:tab/>
+      </w:r>
+      <w:r>
+        <w:rPr>
+          <w:rFonts w:ascii="Times New Roman" w:hAnsi="Times New Roman"/>
+          <w:b w:val="0"/>
+          <w:i w:val="0"/>
+          <w:color w:val="000000"/>
+          <w:sz w:val="24"/>
+        </w:rPr>
+        <w:t>FastAPI Asynchronous Architecture: FastAPI offers high concurrency and native Pydantic data validation, providing lightweight, low-overhead endpoint processing for session memory handling and tool execution.</w:t>
+      </w:r>
+    </w:p>
+    <w:p>
+      <w:pPr>
+        <w:spacing w:before="20" w:after="80" w:line="324" w:lineRule="auto"/>
+        <w:ind w:left="432" w:hanging="432"/>
+        <w:jc w:val="both"/>
+      </w:pPr>
+      <w:r>
+        <w:rPr>
+          <w:rFonts w:ascii="Times New Roman" w:hAnsi="Times New Roman"/>
+          <w:b/>
+          <w:i w:val="0"/>
+          <w:color w:val="000000"/>
+          <w:sz w:val="24"/>
+        </w:rPr>
+        <w:t>•</w:t>
+        <w:tab/>
+      </w:r>
+      <w:r>
+        <w:rPr>
+          <w:rFonts w:ascii="Times New Roman" w:hAnsi="Times New Roman"/>
+          <w:b w:val="0"/>
+          <w:i w:val="0"/>
+          <w:color w:val="000000"/>
+          <w:sz w:val="24"/>
+        </w:rPr>
+        <w:t>Native Web Audio &amp; Speech APIs: Utilizing vanilla browser APIs eliminates bulky multi-megabyte sound libraries or external audio streams, ensuring zero-dependency deployment and cross-device compatibility.</w:t>
+      </w:r>
+    </w:p>
     <w:p>
       <w:r>
         <w:br w:type="page"/>
@@ -3841,39 +3813,7 @@
           <w:color w:val="000000"/>
           <w:sz w:val="22"/>
         </w:rPr>
-        <w:t>[6]  Docker Documentation. (2024). "Containerization Reference &amp; Best Practices." Available: https://docs.docker.com</w:t>
-      </w:r>
-    </w:p>
-    <w:p>
-      <w:pPr>
-        <w:spacing w:before="40" w:after="120" w:line="324" w:lineRule="auto"/>
-        <w:jc w:val="both"/>
-      </w:pPr>
-      <w:r>
-        <w:rPr>
-          <w:rFonts w:ascii="Times New Roman" w:hAnsi="Times New Roman"/>
-          <w:b w:val="0"/>
-          <w:i w:val="0"/>
-          <w:color w:val="000000"/>
-          <w:sz w:val="22"/>
-        </w:rPr>
-        <w:t>[7]  GitHub Pages Documentation. (2024). "Publishing Static Websites from Repositories." Available: https://docs.github.com/pages</w:t>
-      </w:r>
-    </w:p>
-    <w:p>
-      <w:pPr>
-        <w:spacing w:before="40" w:after="120" w:line="324" w:lineRule="auto"/>
-        <w:jc w:val="both"/>
-      </w:pPr>
-      <w:r>
-        <w:rPr>
-          <w:rFonts w:ascii="Times New Roman" w:hAnsi="Times New Roman"/>
-          <w:b w:val="0"/>
-          <w:i w:val="0"/>
-          <w:color w:val="000000"/>
-          <w:sz w:val="22"/>
-        </w:rPr>
-        <w:t>[8]  Prasad Kankhar. (2026). "AIAD - Chronicles of Prasa Repository &amp; Live Deployment." GitHub: https://github.com/prasadkankhar10/AIAD</w:t>
+        <w:t>[6]  Prasad Kankhar. (2026). "AIAD - Chronicles of Prasa Repository &amp; Live Deployment." GitHub: https://github.com/prasadkankhar10/AIAD</w:t>
       </w:r>
     </w:p>
     <w:sectPr>

</xml_diff>